<commit_message>
Update Prueba_Tecnica v2 (1) (1).docx
</commit_message>
<xml_diff>
--- a/Prueba_Tecnica v2 (1) (1).docx
+++ b/Prueba_Tecnica v2 (1) (1).docx
@@ -617,1486 +617,13 @@
       </w:pPr>
       <w:r>
         <w:rPr>
-          <w:rtl w:val="0"/>
-        </w:rPr>
-      </w:r>
-    </w:p>
-    <w:p>
-      <w:pPr>
-        <w:keepNext w:val="1"/>
-        <w:keepLines w:val="0"/>
-        <w:pageBreakBefore w:val="0"/>
-        <w:widowControl w:val="1"/>
-        <w:pBdr>
-          <w:top w:space="0" w:sz="0" w:val="nil"/>
-          <w:left w:space="0" w:sz="0" w:val="nil"/>
-          <w:bottom w:space="0" w:sz="0" w:val="nil"/>
-          <w:right w:space="0" w:sz="0" w:val="nil"/>
-          <w:between w:space="0" w:sz="0" w:val="nil"/>
-        </w:pBdr>
-        <w:shd w:fill="auto" w:val="clear"/>
-        <w:spacing w:after="60" w:before="240" w:line="240" w:lineRule="auto"/>
-        <w:ind w:left="0" w:right="0" w:firstLine="0"/>
-        <w:jc w:val="left"/>
-        <w:rPr>
-          <w:rFonts w:ascii="Cambria" w:cs="Cambria" w:eastAsia="Cambria" w:hAnsi="Cambria"/>
-          <w:b w:val="1"/>
-          <w:i w:val="1"/>
-          <w:smallCaps w:val="0"/>
-          <w:strike w:val="0"/>
-          <w:color w:val="000000"/>
-          <w:sz w:val="28"/>
-          <w:szCs w:val="28"/>
-          <w:u w:val="none"/>
-          <w:shd w:fill="auto" w:val="clear"/>
-          <w:vertAlign w:val="baseline"/>
-        </w:rPr>
-      </w:pPr>
-      <w:r>
-        <w:rPr>
-          <w:rFonts w:ascii="Cambria" w:cs="Cambria" w:eastAsia="Cambria" w:hAnsi="Cambria"/>
-          <w:b w:val="1"/>
-          <w:i w:val="1"/>
-          <w:smallCaps w:val="0"/>
-          <w:strike w:val="0"/>
-          <w:color w:val="000000"/>
-          <w:sz w:val="28"/>
-          <w:szCs w:val="28"/>
-          <w:u w:val="none"/>
-          <w:shd w:fill="auto" w:val="clear"/>
-          <w:vertAlign w:val="baseline"/>
-          <w:rtl w:val="0"/>
-        </w:rPr>
-        <w:t xml:space="preserve">2. Consideraciones de Diseño (Arquitectura)</w:t>
-      </w:r>
-    </w:p>
-    <w:p>
-      <w:pPr>
-        <w:rPr>
-          <w:rFonts w:ascii="Arial Narrow" w:cs="Arial Narrow" w:eastAsia="Arial Narrow" w:hAnsi="Arial Narrow"/>
-          <w:sz w:val="22"/>
-          <w:szCs w:val="22"/>
-          <w:vertAlign w:val="baseline"/>
-        </w:rPr>
-      </w:pPr>
-      <w:r>
-        <w:rPr>
-          <w:rtl w:val="0"/>
-        </w:rPr>
-      </w:r>
-    </w:p>
-    <w:p>
-      <w:pPr>
-        <w:rPr>
-          <w:rFonts w:ascii="Arial Narrow" w:cs="Arial Narrow" w:eastAsia="Arial Narrow" w:hAnsi="Arial Narrow"/>
-          <w:sz w:val="22"/>
-          <w:szCs w:val="22"/>
-          <w:vertAlign w:val="baseline"/>
-        </w:rPr>
-      </w:pPr>
-      <w:r>
-        <w:rPr>
-          <w:rFonts w:ascii="Arial Narrow" w:cs="Arial Narrow" w:eastAsia="Arial Narrow" w:hAnsi="Arial Narrow"/>
-          <w:sz w:val="22"/>
-          <w:szCs w:val="22"/>
-          <w:vertAlign w:val="baseline"/>
-          <w:rtl w:val="0"/>
-        </w:rPr>
-        <w:t xml:space="preserve">De acuerdo al enunciado del punto 1, presente un diseño general orientado a objetos, definiendo las clases y funciones necesarias, herencia y otros componentes que considere necesarios.</w:t>
-      </w:r>
-    </w:p>
-    <w:p>
-      <w:pPr>
-        <w:rPr>
-          <w:rFonts w:ascii="Arial Narrow" w:cs="Arial Narrow" w:eastAsia="Arial Narrow" w:hAnsi="Arial Narrow"/>
-          <w:sz w:val="22"/>
-          <w:szCs w:val="22"/>
-        </w:rPr>
-      </w:pPr>
-      <w:bookmarkStart w:colFirst="0" w:colLast="0" w:name="_heading=h.xycjpsutvv4z" w:id="0"/>
-      <w:bookmarkEnd w:id="0"/>
-      <w:r>
-        <w:rPr>
-          <w:rtl w:val="0"/>
-        </w:rPr>
-      </w:r>
-    </w:p>
-    <w:p>
-      <w:pPr>
-        <w:rPr>
-          <w:rFonts w:ascii="Arial Narrow" w:cs="Arial Narrow" w:eastAsia="Arial Narrow" w:hAnsi="Arial Narrow"/>
-          <w:sz w:val="22"/>
-          <w:szCs w:val="22"/>
-        </w:rPr>
-      </w:pPr>
-      <w:bookmarkStart w:colFirst="0" w:colLast="0" w:name="_heading=h.gjdgxs" w:id="1"/>
-      <w:bookmarkEnd w:id="1"/>
-      <w:r>
-        <w:rPr>
-          <w:rFonts w:ascii="Arial Narrow" w:cs="Arial Narrow" w:eastAsia="Arial Narrow" w:hAnsi="Arial Narrow"/>
-          <w:sz w:val="22"/>
-          <w:szCs w:val="22"/>
-          <w:rtl w:val="0"/>
-        </w:rPr>
-        <w:t xml:space="preserve">clases:</w:t>
-      </w:r>
-    </w:p>
-    <w:p>
-      <w:pPr>
-        <w:numPr>
-          <w:ilvl w:val="1"/>
-          <w:numId w:val="3"/>
-        </w:numPr>
-        <w:ind w:left="1440" w:hanging="360"/>
-        <w:rPr>
-          <w:rFonts w:ascii="Arial Narrow" w:cs="Arial Narrow" w:eastAsia="Arial Narrow" w:hAnsi="Arial Narrow"/>
-          <w:sz w:val="22"/>
-          <w:szCs w:val="22"/>
-        </w:rPr>
-      </w:pPr>
-      <w:r>
-        <w:rPr>
-          <w:rFonts w:ascii="Arial Narrow" w:cs="Arial Narrow" w:eastAsia="Arial Narrow" w:hAnsi="Arial Narrow"/>
-          <w:sz w:val="22"/>
-          <w:szCs w:val="22"/>
-          <w:rtl w:val="0"/>
-        </w:rPr>
-        <w:t xml:space="preserve">clase trámites</w:t>
-      </w:r>
-    </w:p>
-    <w:p>
-      <w:pPr>
-        <w:numPr>
-          <w:ilvl w:val="2"/>
-          <w:numId w:val="3"/>
-        </w:numPr>
-        <w:ind w:left="2160" w:hanging="360"/>
-        <w:rPr>
-          <w:rFonts w:ascii="Arial Narrow" w:cs="Arial Narrow" w:eastAsia="Arial Narrow" w:hAnsi="Arial Narrow"/>
-          <w:sz w:val="22"/>
-          <w:szCs w:val="22"/>
-        </w:rPr>
-      </w:pPr>
-      <w:r>
-        <w:rPr>
-          <w:rFonts w:ascii="Arial Narrow" w:cs="Arial Narrow" w:eastAsia="Arial Narrow" w:hAnsi="Arial Narrow"/>
-          <w:sz w:val="22"/>
-          <w:szCs w:val="22"/>
-          <w:rtl w:val="0"/>
-        </w:rPr>
-        <w:t xml:space="preserve">nombre</w:t>
-      </w:r>
-    </w:p>
-    <w:p>
-      <w:pPr>
-        <w:numPr>
-          <w:ilvl w:val="2"/>
-          <w:numId w:val="3"/>
-        </w:numPr>
-        <w:ind w:left="2160" w:hanging="360"/>
-        <w:rPr>
-          <w:rFonts w:ascii="Arial Narrow" w:cs="Arial Narrow" w:eastAsia="Arial Narrow" w:hAnsi="Arial Narrow"/>
-          <w:sz w:val="22"/>
-          <w:szCs w:val="22"/>
-        </w:rPr>
-      </w:pPr>
-      <w:r>
-        <w:rPr>
-          <w:rFonts w:ascii="Arial Narrow" w:cs="Arial Narrow" w:eastAsia="Arial Narrow" w:hAnsi="Arial Narrow"/>
-          <w:sz w:val="22"/>
-          <w:szCs w:val="22"/>
-          <w:rtl w:val="0"/>
-        </w:rPr>
-        <w:t xml:space="preserve">descripción</w:t>
-      </w:r>
-    </w:p>
-    <w:p>
-      <w:pPr>
-        <w:numPr>
-          <w:ilvl w:val="2"/>
-          <w:numId w:val="3"/>
-        </w:numPr>
-        <w:ind w:left="2160" w:hanging="360"/>
-        <w:rPr>
-          <w:rFonts w:ascii="Arial Narrow" w:cs="Arial Narrow" w:eastAsia="Arial Narrow" w:hAnsi="Arial Narrow"/>
-          <w:sz w:val="22"/>
-          <w:szCs w:val="22"/>
-        </w:rPr>
-      </w:pPr>
-      <w:r>
-        <w:rPr>
-          <w:rFonts w:ascii="Arial Narrow" w:cs="Arial Narrow" w:eastAsia="Arial Narrow" w:hAnsi="Arial Narrow"/>
-          <w:sz w:val="22"/>
-          <w:szCs w:val="22"/>
-          <w:rtl w:val="0"/>
-        </w:rPr>
-        <w:t xml:space="preserve">fecha de radicado</w:t>
-      </w:r>
-    </w:p>
-    <w:p>
-      <w:pPr>
-        <w:numPr>
-          <w:ilvl w:val="2"/>
-          <w:numId w:val="3"/>
-        </w:numPr>
-        <w:ind w:left="2160" w:hanging="360"/>
-        <w:rPr>
-          <w:rFonts w:ascii="Arial Narrow" w:cs="Arial Narrow" w:eastAsia="Arial Narrow" w:hAnsi="Arial Narrow"/>
-          <w:sz w:val="22"/>
-          <w:szCs w:val="22"/>
-        </w:rPr>
-      </w:pPr>
-      <w:r>
-        <w:rPr>
-          <w:rFonts w:ascii="Arial Narrow" w:cs="Arial Narrow" w:eastAsia="Arial Narrow" w:hAnsi="Arial Narrow"/>
-          <w:sz w:val="22"/>
-          <w:szCs w:val="22"/>
-          <w:rtl w:val="0"/>
-        </w:rPr>
-        <w:t xml:space="preserve">estado del trámite</w:t>
-      </w:r>
-    </w:p>
-    <w:p>
-      <w:pPr>
-        <w:numPr>
-          <w:ilvl w:val="2"/>
-          <w:numId w:val="3"/>
-        </w:numPr>
-        <w:ind w:left="2160" w:hanging="360"/>
-        <w:rPr>
-          <w:rFonts w:ascii="Arial Narrow" w:cs="Arial Narrow" w:eastAsia="Arial Narrow" w:hAnsi="Arial Narrow"/>
-          <w:sz w:val="22"/>
-          <w:szCs w:val="22"/>
-        </w:rPr>
-      </w:pPr>
-      <w:r>
-        <w:rPr>
-          <w:rFonts w:ascii="Arial Narrow" w:cs="Arial Narrow" w:eastAsia="Arial Narrow" w:hAnsi="Arial Narrow"/>
-          <w:sz w:val="22"/>
-          <w:szCs w:val="22"/>
-          <w:rtl w:val="0"/>
-        </w:rPr>
-        <w:t xml:space="preserve">quien radica</w:t>
-      </w:r>
-    </w:p>
-    <w:p>
-      <w:pPr>
-        <w:numPr>
-          <w:ilvl w:val="2"/>
-          <w:numId w:val="3"/>
-        </w:numPr>
-        <w:ind w:left="2160" w:hanging="360"/>
-        <w:rPr>
-          <w:rFonts w:ascii="Arial Narrow" w:cs="Arial Narrow" w:eastAsia="Arial Narrow" w:hAnsi="Arial Narrow"/>
-          <w:sz w:val="22"/>
-          <w:szCs w:val="22"/>
-        </w:rPr>
-      </w:pPr>
-      <w:r>
-        <w:rPr>
-          <w:rFonts w:ascii="Arial Narrow" w:cs="Arial Narrow" w:eastAsia="Arial Narrow" w:hAnsi="Arial Narrow"/>
-          <w:sz w:val="22"/>
-          <w:szCs w:val="22"/>
-          <w:rtl w:val="0"/>
-        </w:rPr>
-        <w:t xml:space="preserve">quien atiende</w:t>
-      </w:r>
-    </w:p>
-    <w:p>
-      <w:pPr>
-        <w:numPr>
-          <w:ilvl w:val="2"/>
-          <w:numId w:val="3"/>
-        </w:numPr>
-        <w:ind w:left="2160" w:hanging="360"/>
-        <w:rPr>
-          <w:rFonts w:ascii="Arial Narrow" w:cs="Arial Narrow" w:eastAsia="Arial Narrow" w:hAnsi="Arial Narrow"/>
-          <w:sz w:val="22"/>
-          <w:szCs w:val="22"/>
-        </w:rPr>
-      </w:pPr>
-      <w:r>
-        <w:rPr>
-          <w:rFonts w:ascii="Arial Narrow" w:cs="Arial Narrow" w:eastAsia="Arial Narrow" w:hAnsi="Arial Narrow"/>
-          <w:sz w:val="22"/>
-          <w:szCs w:val="22"/>
-          <w:rtl w:val="0"/>
-        </w:rPr>
-        <w:t xml:space="preserve">historial de modificaciones</w:t>
-      </w:r>
-    </w:p>
-    <w:p>
-      <w:pPr>
-        <w:numPr>
-          <w:ilvl w:val="2"/>
-          <w:numId w:val="3"/>
-        </w:numPr>
-        <w:ind w:left="2160" w:hanging="360"/>
-        <w:rPr>
-          <w:rFonts w:ascii="Arial Narrow" w:cs="Arial Narrow" w:eastAsia="Arial Narrow" w:hAnsi="Arial Narrow"/>
-          <w:sz w:val="22"/>
-          <w:szCs w:val="22"/>
-        </w:rPr>
-      </w:pPr>
-      <w:r>
-        <w:rPr>
-          <w:rFonts w:ascii="Arial Narrow" w:cs="Arial Narrow" w:eastAsia="Arial Narrow" w:hAnsi="Arial Narrow"/>
-          <w:sz w:val="22"/>
-          <w:szCs w:val="22"/>
-          <w:rtl w:val="0"/>
-        </w:rPr>
-        <w:t xml:space="preserve">Numero+año de radicación</w:t>
-      </w:r>
-    </w:p>
-    <w:p>
-      <w:pPr>
-        <w:numPr>
-          <w:ilvl w:val="1"/>
-          <w:numId w:val="3"/>
-        </w:numPr>
-        <w:ind w:left="1440" w:hanging="360"/>
-        <w:rPr>
-          <w:rFonts w:ascii="Arial Narrow" w:cs="Arial Narrow" w:eastAsia="Arial Narrow" w:hAnsi="Arial Narrow"/>
-          <w:sz w:val="22"/>
-          <w:szCs w:val="22"/>
-        </w:rPr>
-      </w:pPr>
-      <w:r>
-        <w:rPr>
-          <w:rFonts w:ascii="Arial Narrow" w:cs="Arial Narrow" w:eastAsia="Arial Narrow" w:hAnsi="Arial Narrow"/>
-          <w:sz w:val="22"/>
-          <w:szCs w:val="22"/>
-          <w:rtl w:val="0"/>
-        </w:rPr>
-        <w:t xml:space="preserve">clase persona</w:t>
-      </w:r>
-    </w:p>
-    <w:p>
-      <w:pPr>
-        <w:numPr>
-          <w:ilvl w:val="2"/>
-          <w:numId w:val="3"/>
-        </w:numPr>
-        <w:ind w:left="2160" w:hanging="360"/>
-        <w:rPr>
-          <w:rFonts w:ascii="Arial Narrow" w:cs="Arial Narrow" w:eastAsia="Arial Narrow" w:hAnsi="Arial Narrow"/>
-          <w:sz w:val="22"/>
-          <w:szCs w:val="22"/>
-        </w:rPr>
-      </w:pPr>
-      <w:r>
-        <w:rPr>
-          <w:rFonts w:ascii="Arial Narrow" w:cs="Arial Narrow" w:eastAsia="Arial Narrow" w:hAnsi="Arial Narrow"/>
-          <w:sz w:val="22"/>
-          <w:szCs w:val="22"/>
-          <w:rtl w:val="0"/>
-        </w:rPr>
-        <w:t xml:space="preserve">tipo de identificación</w:t>
-      </w:r>
-    </w:p>
-    <w:p>
-      <w:pPr>
-        <w:numPr>
-          <w:ilvl w:val="2"/>
-          <w:numId w:val="3"/>
-        </w:numPr>
-        <w:ind w:left="2160" w:hanging="360"/>
-        <w:rPr>
-          <w:rFonts w:ascii="Arial Narrow" w:cs="Arial Narrow" w:eastAsia="Arial Narrow" w:hAnsi="Arial Narrow"/>
-          <w:sz w:val="22"/>
-          <w:szCs w:val="22"/>
-        </w:rPr>
-      </w:pPr>
-      <w:r>
-        <w:rPr>
-          <w:rFonts w:ascii="Arial Narrow" w:cs="Arial Narrow" w:eastAsia="Arial Narrow" w:hAnsi="Arial Narrow"/>
-          <w:sz w:val="22"/>
-          <w:szCs w:val="22"/>
-          <w:rtl w:val="0"/>
-        </w:rPr>
-        <w:t xml:space="preserve">numero de identificación</w:t>
-      </w:r>
-    </w:p>
-    <w:p>
-      <w:pPr>
-        <w:numPr>
-          <w:ilvl w:val="2"/>
-          <w:numId w:val="3"/>
-        </w:numPr>
-        <w:ind w:left="2160" w:hanging="360"/>
-        <w:rPr>
-          <w:rFonts w:ascii="Arial Narrow" w:cs="Arial Narrow" w:eastAsia="Arial Narrow" w:hAnsi="Arial Narrow"/>
-          <w:sz w:val="22"/>
-          <w:szCs w:val="22"/>
-        </w:rPr>
-      </w:pPr>
-      <w:r>
-        <w:rPr>
-          <w:rFonts w:ascii="Arial Narrow" w:cs="Arial Narrow" w:eastAsia="Arial Narrow" w:hAnsi="Arial Narrow"/>
-          <w:sz w:val="22"/>
-          <w:szCs w:val="22"/>
-          <w:rtl w:val="0"/>
-        </w:rPr>
-        <w:t xml:space="preserve">nombres</w:t>
-      </w:r>
-    </w:p>
-    <w:p>
-      <w:pPr>
-        <w:numPr>
-          <w:ilvl w:val="2"/>
-          <w:numId w:val="3"/>
-        </w:numPr>
-        <w:ind w:left="2160" w:hanging="360"/>
-        <w:rPr>
-          <w:rFonts w:ascii="Arial Narrow" w:cs="Arial Narrow" w:eastAsia="Arial Narrow" w:hAnsi="Arial Narrow"/>
-          <w:sz w:val="22"/>
-          <w:szCs w:val="22"/>
-        </w:rPr>
-      </w:pPr>
-      <w:r>
-        <w:rPr>
-          <w:rFonts w:ascii="Arial Narrow" w:cs="Arial Narrow" w:eastAsia="Arial Narrow" w:hAnsi="Arial Narrow"/>
-          <w:sz w:val="22"/>
-          <w:szCs w:val="22"/>
-          <w:rtl w:val="0"/>
-        </w:rPr>
-        <w:t xml:space="preserve">apellidos</w:t>
-      </w:r>
-    </w:p>
-    <w:p>
-      <w:pPr>
-        <w:numPr>
-          <w:ilvl w:val="2"/>
-          <w:numId w:val="3"/>
-        </w:numPr>
-        <w:ind w:left="2160" w:hanging="360"/>
-        <w:rPr>
-          <w:rFonts w:ascii="Arial Narrow" w:cs="Arial Narrow" w:eastAsia="Arial Narrow" w:hAnsi="Arial Narrow"/>
-          <w:sz w:val="22"/>
-          <w:szCs w:val="22"/>
-        </w:rPr>
-      </w:pPr>
-      <w:r>
-        <w:rPr>
-          <w:rFonts w:ascii="Arial Narrow" w:cs="Arial Narrow" w:eastAsia="Arial Narrow" w:hAnsi="Arial Narrow"/>
-          <w:sz w:val="22"/>
-          <w:szCs w:val="22"/>
-          <w:rtl w:val="0"/>
-        </w:rPr>
-        <w:t xml:space="preserve">telefono</w:t>
-      </w:r>
-    </w:p>
-    <w:p>
-      <w:pPr>
-        <w:numPr>
-          <w:ilvl w:val="2"/>
-          <w:numId w:val="3"/>
-        </w:numPr>
-        <w:ind w:left="2160" w:hanging="360"/>
-        <w:rPr>
-          <w:rFonts w:ascii="Arial Narrow" w:cs="Arial Narrow" w:eastAsia="Arial Narrow" w:hAnsi="Arial Narrow"/>
-          <w:sz w:val="22"/>
-          <w:szCs w:val="22"/>
-        </w:rPr>
-      </w:pPr>
-      <w:r>
-        <w:rPr>
-          <w:rFonts w:ascii="Arial Narrow" w:cs="Arial Narrow" w:eastAsia="Arial Narrow" w:hAnsi="Arial Narrow"/>
-          <w:sz w:val="22"/>
-          <w:szCs w:val="22"/>
-          <w:rtl w:val="0"/>
-        </w:rPr>
-        <w:t xml:space="preserve">direccion</w:t>
-      </w:r>
-    </w:p>
-    <w:p>
-      <w:pPr>
-        <w:numPr>
-          <w:ilvl w:val="2"/>
-          <w:numId w:val="3"/>
-        </w:numPr>
-        <w:ind w:left="2160" w:hanging="360"/>
-        <w:rPr>
-          <w:rFonts w:ascii="Arial Narrow" w:cs="Arial Narrow" w:eastAsia="Arial Narrow" w:hAnsi="Arial Narrow"/>
-          <w:sz w:val="22"/>
-          <w:szCs w:val="22"/>
-        </w:rPr>
-      </w:pPr>
-      <w:r>
-        <w:rPr>
-          <w:rFonts w:ascii="Arial Narrow" w:cs="Arial Narrow" w:eastAsia="Arial Narrow" w:hAnsi="Arial Narrow"/>
-          <w:sz w:val="22"/>
-          <w:szCs w:val="22"/>
-          <w:rtl w:val="0"/>
-        </w:rPr>
-        <w:t xml:space="preserve">correo electrónico</w:t>
-      </w:r>
-    </w:p>
-    <w:p>
-      <w:pPr>
-        <w:numPr>
-          <w:ilvl w:val="1"/>
-          <w:numId w:val="3"/>
-        </w:numPr>
-        <w:ind w:left="1440" w:hanging="360"/>
-        <w:rPr>
-          <w:rFonts w:ascii="Arial Narrow" w:cs="Arial Narrow" w:eastAsia="Arial Narrow" w:hAnsi="Arial Narrow"/>
-          <w:sz w:val="22"/>
-          <w:szCs w:val="22"/>
-        </w:rPr>
-      </w:pPr>
-      <w:r>
-        <w:rPr>
-          <w:rFonts w:ascii="Arial Narrow" w:cs="Arial Narrow" w:eastAsia="Arial Narrow" w:hAnsi="Arial Narrow"/>
-          <w:sz w:val="22"/>
-          <w:szCs w:val="22"/>
-          <w:rtl w:val="0"/>
-        </w:rPr>
-        <w:t xml:space="preserve">clase Empleado</w:t>
-      </w:r>
-    </w:p>
-    <w:p>
-      <w:pPr>
-        <w:numPr>
-          <w:ilvl w:val="2"/>
-          <w:numId w:val="3"/>
-        </w:numPr>
-        <w:ind w:left="2160" w:hanging="360"/>
-        <w:rPr>
-          <w:rFonts w:ascii="Arial Narrow" w:cs="Arial Narrow" w:eastAsia="Arial Narrow" w:hAnsi="Arial Narrow"/>
-          <w:sz w:val="22"/>
-          <w:szCs w:val="22"/>
-        </w:rPr>
-      </w:pPr>
-      <w:r>
-        <w:rPr>
-          <w:rFonts w:ascii="Arial Narrow" w:cs="Arial Narrow" w:eastAsia="Arial Narrow" w:hAnsi="Arial Narrow"/>
-          <w:sz w:val="22"/>
-          <w:szCs w:val="22"/>
-          <w:rtl w:val="0"/>
-        </w:rPr>
-        <w:t xml:space="preserve">hereda de persona</w:t>
-      </w:r>
-    </w:p>
-    <w:p>
-      <w:pPr>
-        <w:numPr>
-          <w:ilvl w:val="2"/>
-          <w:numId w:val="3"/>
-        </w:numPr>
-        <w:ind w:left="2160" w:hanging="360"/>
-        <w:rPr>
-          <w:rFonts w:ascii="Arial Narrow" w:cs="Arial Narrow" w:eastAsia="Arial Narrow" w:hAnsi="Arial Narrow"/>
-          <w:sz w:val="22"/>
-          <w:szCs w:val="22"/>
-        </w:rPr>
-      </w:pPr>
-      <w:r>
-        <w:rPr>
-          <w:rFonts w:ascii="Arial Narrow" w:cs="Arial Narrow" w:eastAsia="Arial Narrow" w:hAnsi="Arial Narrow"/>
-          <w:sz w:val="22"/>
-          <w:szCs w:val="22"/>
-          <w:rtl w:val="0"/>
-        </w:rPr>
-        <w:t xml:space="preserve">dependencia</w:t>
-      </w:r>
-    </w:p>
-    <w:p>
-      <w:pPr>
-        <w:numPr>
-          <w:ilvl w:val="2"/>
-          <w:numId w:val="3"/>
-        </w:numPr>
-        <w:ind w:left="2160" w:hanging="360"/>
-        <w:rPr>
-          <w:rFonts w:ascii="Arial Narrow" w:cs="Arial Narrow" w:eastAsia="Arial Narrow" w:hAnsi="Arial Narrow"/>
-          <w:sz w:val="22"/>
-          <w:szCs w:val="22"/>
-        </w:rPr>
-      </w:pPr>
-      <w:r>
-        <w:rPr>
-          <w:rFonts w:ascii="Arial Narrow" w:cs="Arial Narrow" w:eastAsia="Arial Narrow" w:hAnsi="Arial Narrow"/>
-          <w:sz w:val="22"/>
-          <w:szCs w:val="22"/>
-          <w:rtl w:val="0"/>
-        </w:rPr>
-        <w:t xml:space="preserve">fecha de ingreso</w:t>
-      </w:r>
-    </w:p>
-    <w:p>
-      <w:pPr>
-        <w:numPr>
-          <w:ilvl w:val="1"/>
-          <w:numId w:val="3"/>
-        </w:numPr>
-        <w:ind w:left="1440" w:hanging="360"/>
-        <w:rPr>
-          <w:rFonts w:ascii="Arial Narrow" w:cs="Arial Narrow" w:eastAsia="Arial Narrow" w:hAnsi="Arial Narrow"/>
-          <w:sz w:val="22"/>
-          <w:szCs w:val="22"/>
-        </w:rPr>
-      </w:pPr>
-      <w:r>
-        <w:rPr>
-          <w:rFonts w:ascii="Arial Narrow" w:cs="Arial Narrow" w:eastAsia="Arial Narrow" w:hAnsi="Arial Narrow"/>
-          <w:sz w:val="22"/>
-          <w:szCs w:val="22"/>
-          <w:rtl w:val="0"/>
-        </w:rPr>
-        <w:t xml:space="preserve">clase Usuario</w:t>
-      </w:r>
-    </w:p>
-    <w:p>
-      <w:pPr>
-        <w:numPr>
-          <w:ilvl w:val="2"/>
-          <w:numId w:val="3"/>
-        </w:numPr>
-        <w:ind w:left="2160" w:hanging="360"/>
-        <w:rPr>
-          <w:rFonts w:ascii="Arial Narrow" w:cs="Arial Narrow" w:eastAsia="Arial Narrow" w:hAnsi="Arial Narrow"/>
-          <w:sz w:val="22"/>
-          <w:szCs w:val="22"/>
-        </w:rPr>
-      </w:pPr>
-      <w:r>
-        <w:rPr>
-          <w:rFonts w:ascii="Arial Narrow" w:cs="Arial Narrow" w:eastAsia="Arial Narrow" w:hAnsi="Arial Narrow"/>
-          <w:sz w:val="22"/>
-          <w:szCs w:val="22"/>
-          <w:rtl w:val="0"/>
-        </w:rPr>
-        <w:t xml:space="preserve">identificador</w:t>
-      </w:r>
-    </w:p>
-    <w:p>
-      <w:pPr>
-        <w:numPr>
-          <w:ilvl w:val="2"/>
-          <w:numId w:val="3"/>
-        </w:numPr>
-        <w:ind w:left="2160" w:hanging="360"/>
-        <w:rPr>
-          <w:rFonts w:ascii="Arial Narrow" w:cs="Arial Narrow" w:eastAsia="Arial Narrow" w:hAnsi="Arial Narrow"/>
-          <w:sz w:val="22"/>
-          <w:szCs w:val="22"/>
-        </w:rPr>
-      </w:pPr>
-      <w:r>
-        <w:rPr>
-          <w:rFonts w:ascii="Arial Narrow" w:cs="Arial Narrow" w:eastAsia="Arial Narrow" w:hAnsi="Arial Narrow"/>
-          <w:sz w:val="22"/>
-          <w:szCs w:val="22"/>
-          <w:rtl w:val="0"/>
-        </w:rPr>
-        <w:t xml:space="preserve">Nombre de usuario</w:t>
-      </w:r>
-    </w:p>
-    <w:p>
-      <w:pPr>
-        <w:numPr>
-          <w:ilvl w:val="2"/>
-          <w:numId w:val="3"/>
-        </w:numPr>
-        <w:ind w:left="2160" w:hanging="360"/>
-        <w:rPr>
-          <w:rFonts w:ascii="Arial Narrow" w:cs="Arial Narrow" w:eastAsia="Arial Narrow" w:hAnsi="Arial Narrow"/>
-          <w:sz w:val="22"/>
-          <w:szCs w:val="22"/>
-        </w:rPr>
-      </w:pPr>
-      <w:r>
-        <w:rPr>
-          <w:rFonts w:ascii="Arial Narrow" w:cs="Arial Narrow" w:eastAsia="Arial Narrow" w:hAnsi="Arial Narrow"/>
-          <w:sz w:val="22"/>
-          <w:szCs w:val="22"/>
-          <w:rtl w:val="0"/>
-        </w:rPr>
-        <w:t xml:space="preserve">password</w:t>
-      </w:r>
-    </w:p>
-    <w:p>
-      <w:pPr>
-        <w:numPr>
-          <w:ilvl w:val="2"/>
-          <w:numId w:val="3"/>
-        </w:numPr>
-        <w:ind w:left="2160" w:hanging="360"/>
-        <w:rPr>
-          <w:rFonts w:ascii="Arial Narrow" w:cs="Arial Narrow" w:eastAsia="Arial Narrow" w:hAnsi="Arial Narrow"/>
-          <w:sz w:val="22"/>
-          <w:szCs w:val="22"/>
-        </w:rPr>
-      </w:pPr>
-      <w:r>
-        <w:rPr>
-          <w:rFonts w:ascii="Arial Narrow" w:cs="Arial Narrow" w:eastAsia="Arial Narrow" w:hAnsi="Arial Narrow"/>
-          <w:sz w:val="22"/>
-          <w:szCs w:val="22"/>
-          <w:rtl w:val="0"/>
-        </w:rPr>
-        <w:t xml:space="preserve">rol</w:t>
-      </w:r>
-    </w:p>
-    <w:p>
-      <w:pPr>
-        <w:numPr>
-          <w:ilvl w:val="1"/>
-          <w:numId w:val="3"/>
-        </w:numPr>
-        <w:ind w:left="1440" w:hanging="360"/>
-        <w:rPr>
-          <w:rFonts w:ascii="Arial Narrow" w:cs="Arial Narrow" w:eastAsia="Arial Narrow" w:hAnsi="Arial Narrow"/>
-          <w:sz w:val="22"/>
-          <w:szCs w:val="22"/>
-        </w:rPr>
-      </w:pPr>
-      <w:r>
-        <w:rPr>
-          <w:rFonts w:ascii="Arial Narrow" w:cs="Arial Narrow" w:eastAsia="Arial Narrow" w:hAnsi="Arial Narrow"/>
-          <w:sz w:val="22"/>
-          <w:szCs w:val="22"/>
-          <w:rtl w:val="0"/>
-        </w:rPr>
-        <w:t xml:space="preserve">clase sistema</w:t>
-      </w:r>
-    </w:p>
-    <w:p>
-      <w:pPr>
-        <w:numPr>
-          <w:ilvl w:val="2"/>
-          <w:numId w:val="3"/>
-        </w:numPr>
-        <w:ind w:left="2160" w:hanging="360"/>
-        <w:rPr>
-          <w:rFonts w:ascii="Arial Narrow" w:cs="Arial Narrow" w:eastAsia="Arial Narrow" w:hAnsi="Arial Narrow"/>
-          <w:sz w:val="22"/>
-          <w:szCs w:val="22"/>
-        </w:rPr>
-      </w:pPr>
-      <w:r>
-        <w:rPr>
-          <w:rFonts w:ascii="Arial Narrow" w:cs="Arial Narrow" w:eastAsia="Arial Narrow" w:hAnsi="Arial Narrow"/>
-          <w:sz w:val="22"/>
-          <w:szCs w:val="22"/>
-          <w:rtl w:val="0"/>
-        </w:rPr>
-        <w:t xml:space="preserve">padre o clase principal que gestionaría la interacción  entre las otras clases</w:t>
-      </w:r>
-    </w:p>
-    <w:p>
-      <w:pPr>
-        <w:ind w:left="720" w:firstLine="0"/>
-        <w:rPr>
-          <w:rFonts w:ascii="Arial Narrow" w:cs="Arial Narrow" w:eastAsia="Arial Narrow" w:hAnsi="Arial Narrow"/>
-          <w:sz w:val="22"/>
-          <w:szCs w:val="22"/>
-        </w:rPr>
-      </w:pPr>
-      <w:r>
-        <w:rPr>
-          <w:rtl w:val="0"/>
-        </w:rPr>
-      </w:r>
-    </w:p>
-    <w:p>
-      <w:pPr>
-        <w:rPr>
-          <w:rFonts w:ascii="Arial Narrow" w:cs="Arial Narrow" w:eastAsia="Arial Narrow" w:hAnsi="Arial Narrow"/>
-          <w:sz w:val="22"/>
-          <w:szCs w:val="22"/>
-        </w:rPr>
-      </w:pPr>
-      <w:bookmarkStart w:colFirst="0" w:colLast="0" w:name="_heading=h.uj5tgtd3g753" w:id="2"/>
-      <w:bookmarkEnd w:id="2"/>
-      <w:r>
-        <w:rPr>
-          <w:rFonts w:ascii="Arial Narrow" w:cs="Arial Narrow" w:eastAsia="Arial Narrow" w:hAnsi="Arial Narrow"/>
-          <w:sz w:val="22"/>
-          <w:szCs w:val="22"/>
-          <w:rtl w:val="0"/>
-        </w:rPr>
-        <w:t xml:space="preserve">funciones:</w:t>
-      </w:r>
-    </w:p>
-    <w:p>
-      <w:pPr>
-        <w:numPr>
-          <w:ilvl w:val="0"/>
-          <w:numId w:val="1"/>
-        </w:numPr>
-        <w:ind w:left="720" w:hanging="360"/>
-        <w:rPr>
-          <w:rFonts w:ascii="Arial Narrow" w:cs="Arial Narrow" w:eastAsia="Arial Narrow" w:hAnsi="Arial Narrow"/>
-          <w:sz w:val="22"/>
-          <w:szCs w:val="22"/>
-          <w:u w:val="none"/>
-        </w:rPr>
-      </w:pPr>
-      <w:bookmarkStart w:colFirst="0" w:colLast="0" w:name="_heading=h.dyd754jsgrpt" w:id="3"/>
-      <w:bookmarkEnd w:id="3"/>
-      <w:r>
-        <w:rPr>
-          <w:rFonts w:ascii="Arial Narrow" w:cs="Arial Narrow" w:eastAsia="Arial Narrow" w:hAnsi="Arial Narrow"/>
-          <w:sz w:val="22"/>
-          <w:szCs w:val="22"/>
-          <w:rtl w:val="0"/>
-        </w:rPr>
-        <w:t xml:space="preserve">registro del tŕamite (POST,CREATE)</w:t>
-      </w:r>
-    </w:p>
-    <w:p>
-      <w:pPr>
-        <w:numPr>
-          <w:ilvl w:val="0"/>
-          <w:numId w:val="1"/>
-        </w:numPr>
-        <w:ind w:left="720" w:hanging="360"/>
-        <w:rPr>
-          <w:rFonts w:ascii="Arial Narrow" w:cs="Arial Narrow" w:eastAsia="Arial Narrow" w:hAnsi="Arial Narrow"/>
-          <w:sz w:val="22"/>
-          <w:szCs w:val="22"/>
-          <w:u w:val="none"/>
-        </w:rPr>
-      </w:pPr>
-      <w:bookmarkStart w:colFirst="0" w:colLast="0" w:name="_heading=h.gmm724cdsrc1" w:id="4"/>
-      <w:bookmarkEnd w:id="4"/>
-      <w:r>
-        <w:rPr>
-          <w:rFonts w:ascii="Arial Narrow" w:cs="Arial Narrow" w:eastAsia="Arial Narrow" w:hAnsi="Arial Narrow"/>
-          <w:sz w:val="22"/>
-          <w:szCs w:val="22"/>
-          <w:rtl w:val="0"/>
-        </w:rPr>
-        <w:t xml:space="preserve">consulta del tramite (GET, READ)</w:t>
-      </w:r>
-    </w:p>
-    <w:p>
-      <w:pPr>
-        <w:numPr>
-          <w:ilvl w:val="0"/>
-          <w:numId w:val="1"/>
-        </w:numPr>
-        <w:ind w:left="720" w:hanging="360"/>
-        <w:rPr>
-          <w:rFonts w:ascii="Arial Narrow" w:cs="Arial Narrow" w:eastAsia="Arial Narrow" w:hAnsi="Arial Narrow"/>
-          <w:sz w:val="22"/>
-          <w:szCs w:val="22"/>
-          <w:u w:val="none"/>
-        </w:rPr>
-      </w:pPr>
-      <w:bookmarkStart w:colFirst="0" w:colLast="0" w:name="_heading=h.8fvq6yvlplx3" w:id="5"/>
-      <w:bookmarkEnd w:id="5"/>
-      <w:r>
-        <w:rPr>
-          <w:rFonts w:ascii="Arial Narrow" w:cs="Arial Narrow" w:eastAsia="Arial Narrow" w:hAnsi="Arial Narrow"/>
-          <w:sz w:val="22"/>
-          <w:szCs w:val="22"/>
-          <w:rtl w:val="0"/>
-        </w:rPr>
-        <w:t xml:space="preserve">editar tramite (PUT,EDIT, PATCH,UPDATE)</w:t>
-      </w:r>
-    </w:p>
-    <w:p>
-      <w:pPr>
-        <w:numPr>
-          <w:ilvl w:val="0"/>
-          <w:numId w:val="1"/>
-        </w:numPr>
-        <w:ind w:left="720" w:hanging="360"/>
-        <w:rPr>
-          <w:rFonts w:ascii="Arial Narrow" w:cs="Arial Narrow" w:eastAsia="Arial Narrow" w:hAnsi="Arial Narrow"/>
-          <w:sz w:val="22"/>
-          <w:szCs w:val="22"/>
-          <w:u w:val="none"/>
-        </w:rPr>
-      </w:pPr>
-      <w:bookmarkStart w:colFirst="0" w:colLast="0" w:name="_heading=h.lk0g3a3mwnqz" w:id="6"/>
-      <w:bookmarkEnd w:id="6"/>
-      <w:r>
-        <w:rPr>
-          <w:rFonts w:ascii="Arial Narrow" w:cs="Arial Narrow" w:eastAsia="Arial Narrow" w:hAnsi="Arial Narrow"/>
-          <w:sz w:val="22"/>
-          <w:szCs w:val="22"/>
-          <w:rtl w:val="0"/>
-        </w:rPr>
-        <w:t xml:space="preserve">eliminar trámite(PUT,EDIT,PATCH,UPDATE,DELETE(solo en caso de que existan errores que no permitan la edición, de lo contrario el tramite aunque sea terminado o eliminado debe conservar un historial por determinado tiempo))</w:t>
-      </w:r>
-    </w:p>
-    <w:p>
-      <w:pPr>
-        <w:numPr>
-          <w:ilvl w:val="0"/>
-          <w:numId w:val="1"/>
-        </w:numPr>
-        <w:ind w:left="720" w:hanging="360"/>
-        <w:rPr>
-          <w:rFonts w:ascii="Arial Narrow" w:cs="Arial Narrow" w:eastAsia="Arial Narrow" w:hAnsi="Arial Narrow"/>
-          <w:sz w:val="22"/>
-          <w:szCs w:val="22"/>
-          <w:u w:val="none"/>
-        </w:rPr>
-      </w:pPr>
-      <w:bookmarkStart w:colFirst="0" w:colLast="0" w:name="_heading=h.5cyrfnzi8336" w:id="7"/>
-      <w:bookmarkEnd w:id="7"/>
-      <w:r>
-        <w:rPr>
-          <w:rFonts w:ascii="Arial Narrow" w:cs="Arial Narrow" w:eastAsia="Arial Narrow" w:hAnsi="Arial Narrow"/>
-          <w:sz w:val="22"/>
-          <w:szCs w:val="22"/>
-          <w:rtl w:val="0"/>
-        </w:rPr>
-        <w:t xml:space="preserve">CRUD general de persona</w:t>
-      </w:r>
-    </w:p>
-    <w:p>
-      <w:pPr>
-        <w:numPr>
-          <w:ilvl w:val="0"/>
-          <w:numId w:val="1"/>
-        </w:numPr>
-        <w:ind w:left="720" w:hanging="360"/>
-        <w:rPr>
-          <w:rFonts w:ascii="Arial Narrow" w:cs="Arial Narrow" w:eastAsia="Arial Narrow" w:hAnsi="Arial Narrow"/>
-          <w:sz w:val="22"/>
-          <w:szCs w:val="22"/>
-          <w:u w:val="none"/>
-        </w:rPr>
-      </w:pPr>
-      <w:bookmarkStart w:colFirst="0" w:colLast="0" w:name="_heading=h.6tagjtcg2cz5" w:id="8"/>
-      <w:bookmarkEnd w:id="8"/>
-      <w:r>
-        <w:rPr>
-          <w:rFonts w:ascii="Arial Narrow" w:cs="Arial Narrow" w:eastAsia="Arial Narrow" w:hAnsi="Arial Narrow"/>
-          <w:sz w:val="22"/>
-          <w:szCs w:val="22"/>
-          <w:rtl w:val="0"/>
-        </w:rPr>
-        <w:t xml:space="preserve">registro de usuario</w:t>
-      </w:r>
-    </w:p>
-    <w:p>
-      <w:pPr>
-        <w:numPr>
-          <w:ilvl w:val="0"/>
-          <w:numId w:val="1"/>
-        </w:numPr>
-        <w:ind w:left="720" w:hanging="360"/>
-        <w:rPr>
-          <w:rFonts w:ascii="Arial Narrow" w:cs="Arial Narrow" w:eastAsia="Arial Narrow" w:hAnsi="Arial Narrow"/>
-          <w:sz w:val="22"/>
-          <w:szCs w:val="22"/>
-          <w:u w:val="none"/>
-        </w:rPr>
-      </w:pPr>
-      <w:bookmarkStart w:colFirst="0" w:colLast="0" w:name="_heading=h.hvmzcydo2iet" w:id="9"/>
-      <w:bookmarkEnd w:id="9"/>
-      <w:r>
-        <w:rPr>
-          <w:rFonts w:ascii="Arial Narrow" w:cs="Arial Narrow" w:eastAsia="Arial Narrow" w:hAnsi="Arial Narrow"/>
-          <w:sz w:val="22"/>
-          <w:szCs w:val="22"/>
-          <w:rtl w:val="0"/>
-        </w:rPr>
-        <w:t xml:space="preserve">acceso de usuario</w:t>
-      </w:r>
-    </w:p>
-    <w:p>
-      <w:pPr>
-        <w:numPr>
-          <w:ilvl w:val="1"/>
-          <w:numId w:val="1"/>
-        </w:numPr>
-        <w:ind w:left="1440" w:hanging="360"/>
-        <w:rPr>
-          <w:rFonts w:ascii="Arial Narrow" w:cs="Arial Narrow" w:eastAsia="Arial Narrow" w:hAnsi="Arial Narrow"/>
-          <w:sz w:val="22"/>
-          <w:szCs w:val="22"/>
-          <w:u w:val="none"/>
-        </w:rPr>
-      </w:pPr>
-      <w:bookmarkStart w:colFirst="0" w:colLast="0" w:name="_heading=h.edmjl94gnich" w:id="10"/>
-      <w:bookmarkEnd w:id="10"/>
-      <w:r>
-        <w:rPr>
-          <w:rFonts w:ascii="Arial Narrow" w:cs="Arial Narrow" w:eastAsia="Arial Narrow" w:hAnsi="Arial Narrow"/>
-          <w:sz w:val="22"/>
-          <w:szCs w:val="22"/>
-          <w:rtl w:val="0"/>
-        </w:rPr>
-        <w:t xml:space="preserve">autorización</w:t>
-      </w:r>
-    </w:p>
-    <w:p>
-      <w:pPr>
-        <w:numPr>
-          <w:ilvl w:val="1"/>
-          <w:numId w:val="1"/>
-        </w:numPr>
-        <w:ind w:left="1440" w:hanging="360"/>
-        <w:rPr>
-          <w:rFonts w:ascii="Arial Narrow" w:cs="Arial Narrow" w:eastAsia="Arial Narrow" w:hAnsi="Arial Narrow"/>
-          <w:sz w:val="22"/>
-          <w:szCs w:val="22"/>
-          <w:u w:val="none"/>
-        </w:rPr>
-      </w:pPr>
-      <w:bookmarkStart w:colFirst="0" w:colLast="0" w:name="_heading=h.n7uylz4o9xva" w:id="11"/>
-      <w:bookmarkEnd w:id="11"/>
-      <w:r>
-        <w:rPr>
-          <w:rFonts w:ascii="Arial Narrow" w:cs="Arial Narrow" w:eastAsia="Arial Narrow" w:hAnsi="Arial Narrow"/>
-          <w:sz w:val="22"/>
-          <w:szCs w:val="22"/>
-          <w:rtl w:val="0"/>
-        </w:rPr>
-        <w:t xml:space="preserve">token de acceso</w:t>
-      </w:r>
-    </w:p>
-    <w:p>
-      <w:pPr>
-        <w:numPr>
-          <w:ilvl w:val="1"/>
-          <w:numId w:val="1"/>
-        </w:numPr>
-        <w:ind w:left="1440" w:hanging="360"/>
-        <w:rPr>
-          <w:rFonts w:ascii="Arial Narrow" w:cs="Arial Narrow" w:eastAsia="Arial Narrow" w:hAnsi="Arial Narrow"/>
-          <w:sz w:val="22"/>
-          <w:szCs w:val="22"/>
-          <w:u w:val="none"/>
-        </w:rPr>
-      </w:pPr>
-      <w:bookmarkStart w:colFirst="0" w:colLast="0" w:name="_heading=h.xt89yw41chpi" w:id="12"/>
-      <w:bookmarkEnd w:id="12"/>
-      <w:r>
-        <w:rPr>
-          <w:rFonts w:ascii="Arial Narrow" w:cs="Arial Narrow" w:eastAsia="Arial Narrow" w:hAnsi="Arial Narrow"/>
-          <w:sz w:val="22"/>
-          <w:szCs w:val="22"/>
-          <w:rtl w:val="0"/>
-        </w:rPr>
-        <w:t xml:space="preserve">registro de actividades</w:t>
-      </w:r>
-    </w:p>
-    <w:p>
-      <w:pPr>
-        <w:rPr>
-          <w:rFonts w:ascii="Arial Narrow" w:cs="Arial Narrow" w:eastAsia="Arial Narrow" w:hAnsi="Arial Narrow"/>
-          <w:sz w:val="22"/>
-          <w:szCs w:val="22"/>
-        </w:rPr>
-      </w:pPr>
-      <w:bookmarkStart w:colFirst="0" w:colLast="0" w:name="_heading=h.rteydnp1l12y" w:id="13"/>
-      <w:bookmarkEnd w:id="13"/>
-      <w:r>
-        <w:rPr>
-          <w:rFonts w:ascii="Arial Narrow" w:cs="Arial Narrow" w:eastAsia="Arial Narrow" w:hAnsi="Arial Narrow"/>
-          <w:sz w:val="22"/>
-          <w:szCs w:val="22"/>
-          <w:rtl w:val="0"/>
-        </w:rPr>
-        <w:t xml:space="preserve">herencias:</w:t>
-      </w:r>
-    </w:p>
-    <w:p>
-      <w:pPr>
-        <w:numPr>
-          <w:ilvl w:val="0"/>
-          <w:numId w:val="6"/>
-        </w:numPr>
-        <w:ind w:left="720" w:hanging="360"/>
-        <w:rPr>
-          <w:rFonts w:ascii="Arial Narrow" w:cs="Arial Narrow" w:eastAsia="Arial Narrow" w:hAnsi="Arial Narrow"/>
-          <w:sz w:val="22"/>
-          <w:szCs w:val="22"/>
-          <w:u w:val="none"/>
-        </w:rPr>
-      </w:pPr>
-      <w:bookmarkStart w:colFirst="0" w:colLast="0" w:name="_heading=h.mqw2cirp2ket" w:id="14"/>
-      <w:bookmarkEnd w:id="14"/>
-      <w:r>
-        <w:rPr>
-          <w:rFonts w:ascii="Arial Narrow" w:cs="Arial Narrow" w:eastAsia="Arial Narrow" w:hAnsi="Arial Narrow"/>
-          <w:sz w:val="22"/>
-          <w:szCs w:val="22"/>
-          <w:rtl w:val="0"/>
-        </w:rPr>
-        <w:t xml:space="preserve">los empleados pueden eredar la clases de persona,</w:t>
-      </w:r>
-    </w:p>
-    <w:p>
-      <w:pPr>
-        <w:numPr>
-          <w:ilvl w:val="0"/>
-          <w:numId w:val="6"/>
-        </w:numPr>
-        <w:ind w:left="720" w:hanging="360"/>
-        <w:rPr>
-          <w:rFonts w:ascii="Arial Narrow" w:cs="Arial Narrow" w:eastAsia="Arial Narrow" w:hAnsi="Arial Narrow"/>
-          <w:sz w:val="22"/>
-          <w:szCs w:val="22"/>
-          <w:u w:val="none"/>
-        </w:rPr>
-      </w:pPr>
-      <w:bookmarkStart w:colFirst="0" w:colLast="0" w:name="_heading=h.arv2ugp1zb5d" w:id="15"/>
-      <w:bookmarkEnd w:id="15"/>
-      <w:r>
-        <w:rPr>
-          <w:rFonts w:ascii="Arial Narrow" w:cs="Arial Narrow" w:eastAsia="Arial Narrow" w:hAnsi="Arial Narrow"/>
-          <w:sz w:val="22"/>
-          <w:szCs w:val="22"/>
-          <w:rtl w:val="0"/>
-        </w:rPr>
-        <w:t xml:space="preserve">los usuarios pueden heredar de persona y adicional de empleados</w:t>
-      </w:r>
-    </w:p>
-    <w:p>
-      <w:pPr>
-        <w:rPr>
-          <w:rFonts w:ascii="Arial Narrow" w:cs="Arial Narrow" w:eastAsia="Arial Narrow" w:hAnsi="Arial Narrow"/>
-          <w:sz w:val="22"/>
-          <w:szCs w:val="22"/>
-        </w:rPr>
-      </w:pPr>
-      <w:bookmarkStart w:colFirst="0" w:colLast="0" w:name="_heading=h.ruhmdfpfrlxw" w:id="16"/>
-      <w:bookmarkEnd w:id="16"/>
-      <w:r>
-        <w:rPr>
-          <w:rtl w:val="0"/>
-        </w:rPr>
-      </w:r>
-    </w:p>
-    <w:p>
-      <w:pPr>
-        <w:rPr>
-          <w:rFonts w:ascii="Arial Narrow" w:cs="Arial Narrow" w:eastAsia="Arial Narrow" w:hAnsi="Arial Narrow"/>
-          <w:sz w:val="22"/>
-          <w:szCs w:val="22"/>
-        </w:rPr>
-      </w:pPr>
-      <w:bookmarkStart w:colFirst="0" w:colLast="0" w:name="_heading=h.dlxr7rdsngsz" w:id="17"/>
-      <w:bookmarkEnd w:id="17"/>
-      <w:r>
-        <w:rPr>
-          <w:rFonts w:ascii="Arial Narrow" w:cs="Arial Narrow" w:eastAsia="Arial Narrow" w:hAnsi="Arial Narrow"/>
-          <w:sz w:val="22"/>
-          <w:szCs w:val="22"/>
-          <w:rtl w:val="0"/>
-        </w:rPr>
-        <w:t xml:space="preserve">otros componentes y/o consideraciones</w:t>
-      </w:r>
-    </w:p>
-    <w:p>
-      <w:pPr>
-        <w:numPr>
-          <w:ilvl w:val="0"/>
-          <w:numId w:val="7"/>
-        </w:numPr>
-        <w:ind w:left="720" w:hanging="360"/>
-        <w:rPr>
-          <w:rFonts w:ascii="Arial Narrow" w:cs="Arial Narrow" w:eastAsia="Arial Narrow" w:hAnsi="Arial Narrow"/>
-          <w:sz w:val="22"/>
-          <w:szCs w:val="22"/>
-          <w:u w:val="none"/>
-        </w:rPr>
-      </w:pPr>
-      <w:bookmarkStart w:colFirst="0" w:colLast="0" w:name="_heading=h.emd2wtvcl77s" w:id="18"/>
-      <w:bookmarkEnd w:id="18"/>
-      <w:r>
-        <w:rPr>
-          <w:rFonts w:ascii="Arial Narrow" w:cs="Arial Narrow" w:eastAsia="Arial Narrow" w:hAnsi="Arial Narrow"/>
-          <w:sz w:val="22"/>
-          <w:szCs w:val="22"/>
-          <w:rtl w:val="0"/>
-        </w:rPr>
-        <w:t xml:space="preserve">interfaces para definir manipulación de documentos y carga de los mismos en una cloud</w:t>
-      </w:r>
-    </w:p>
-    <w:p>
-      <w:pPr>
-        <w:numPr>
-          <w:ilvl w:val="0"/>
-          <w:numId w:val="7"/>
-        </w:numPr>
-        <w:ind w:left="720" w:hanging="360"/>
-        <w:rPr>
-          <w:rFonts w:ascii="Arial Narrow" w:cs="Arial Narrow" w:eastAsia="Arial Narrow" w:hAnsi="Arial Narrow"/>
-          <w:sz w:val="22"/>
-          <w:szCs w:val="22"/>
-          <w:u w:val="none"/>
-        </w:rPr>
-      </w:pPr>
-      <w:bookmarkStart w:colFirst="0" w:colLast="0" w:name="_heading=h.lham0v5m8489" w:id="19"/>
-      <w:bookmarkEnd w:id="19"/>
-      <w:r>
-        <w:rPr>
-          <w:rFonts w:ascii="Arial Narrow" w:cs="Arial Narrow" w:eastAsia="Arial Narrow" w:hAnsi="Arial Narrow"/>
-          <w:sz w:val="22"/>
-          <w:szCs w:val="22"/>
-          <w:rtl w:val="0"/>
-        </w:rPr>
-        <w:t xml:space="preserve">es recomendable usar una BD relacional para poder general las relaciones entre las clases</w:t>
-      </w:r>
-    </w:p>
-    <w:p>
-      <w:pPr>
-        <w:numPr>
-          <w:ilvl w:val="0"/>
-          <w:numId w:val="7"/>
-        </w:numPr>
-        <w:ind w:left="720" w:hanging="360"/>
-        <w:rPr>
-          <w:rFonts w:ascii="Arial Narrow" w:cs="Arial Narrow" w:eastAsia="Arial Narrow" w:hAnsi="Arial Narrow"/>
-          <w:sz w:val="22"/>
-          <w:szCs w:val="22"/>
-          <w:u w:val="none"/>
-        </w:rPr>
-      </w:pPr>
-      <w:bookmarkStart w:colFirst="0" w:colLast="0" w:name="_heading=h.8khpkot7fki6" w:id="20"/>
-      <w:bookmarkEnd w:id="20"/>
-      <w:r>
-        <w:rPr>
-          <w:rFonts w:ascii="Arial Narrow" w:cs="Arial Narrow" w:eastAsia="Arial Narrow" w:hAnsi="Arial Narrow"/>
-          <w:sz w:val="22"/>
-          <w:szCs w:val="22"/>
-          <w:rtl w:val="0"/>
-        </w:rPr>
-        <w:t xml:space="preserve">Implementación de componentes de seguridad como JWT para las autenticaciones</w:t>
-      </w:r>
-    </w:p>
-    <w:p>
-      <w:pPr>
-        <w:ind w:left="720" w:firstLine="0"/>
-        <w:rPr>
-          <w:rFonts w:ascii="Arial Narrow" w:cs="Arial Narrow" w:eastAsia="Arial Narrow" w:hAnsi="Arial Narrow"/>
-          <w:sz w:val="22"/>
-          <w:szCs w:val="22"/>
-        </w:rPr>
-      </w:pPr>
-      <w:bookmarkStart w:colFirst="0" w:colLast="0" w:name="_heading=h.c9di6g9ak88c" w:id="21"/>
-      <w:bookmarkEnd w:id="21"/>
-      <w:r>
-        <w:rPr>
-          <w:rtl w:val="0"/>
-        </w:rPr>
-      </w:r>
-    </w:p>
-    <w:p>
-      <w:pPr>
-        <w:keepNext w:val="1"/>
-        <w:keepLines w:val="0"/>
-        <w:pageBreakBefore w:val="0"/>
-        <w:widowControl w:val="1"/>
-        <w:pBdr>
-          <w:top w:space="0" w:sz="0" w:val="nil"/>
-          <w:left w:space="0" w:sz="0" w:val="nil"/>
-          <w:bottom w:space="0" w:sz="0" w:val="nil"/>
-          <w:right w:space="0" w:sz="0" w:val="nil"/>
-          <w:between w:space="0" w:sz="0" w:val="nil"/>
-        </w:pBdr>
-        <w:shd w:fill="auto" w:val="clear"/>
-        <w:spacing w:after="60" w:before="240" w:line="240" w:lineRule="auto"/>
-        <w:ind w:left="0" w:right="0" w:firstLine="0"/>
-        <w:jc w:val="left"/>
-        <w:rPr>
-          <w:rFonts w:ascii="Cambria" w:cs="Cambria" w:eastAsia="Cambria" w:hAnsi="Cambria"/>
-          <w:b w:val="1"/>
-          <w:i w:val="1"/>
-          <w:smallCaps w:val="0"/>
-          <w:strike w:val="0"/>
-          <w:color w:val="000000"/>
-          <w:sz w:val="28"/>
-          <w:szCs w:val="28"/>
-          <w:u w:val="none"/>
-          <w:shd w:fill="auto" w:val="clear"/>
-          <w:vertAlign w:val="baseline"/>
-        </w:rPr>
-      </w:pPr>
-      <w:r>
-        <w:rPr>
-          <w:rFonts w:ascii="Cambria" w:cs="Cambria" w:eastAsia="Cambria" w:hAnsi="Cambria"/>
-          <w:b w:val="1"/>
-          <w:i w:val="1"/>
-          <w:smallCaps w:val="0"/>
-          <w:strike w:val="0"/>
-          <w:color w:val="000000"/>
-          <w:sz w:val="28"/>
-          <w:szCs w:val="28"/>
-          <w:u w:val="none"/>
-          <w:shd w:fill="auto" w:val="clear"/>
-          <w:vertAlign w:val="baseline"/>
-          <w:rtl w:val="0"/>
-        </w:rPr>
-        <w:t xml:space="preserve">3. Consideraciones de </w:t>
-      </w:r>
-      <w:r>
-        <w:rPr>
-          <w:rFonts w:ascii="Cambria" w:cs="Cambria" w:eastAsia="Cambria" w:hAnsi="Cambria"/>
-          <w:b w:val="1"/>
-          <w:i w:val="1"/>
-          <w:sz w:val="28"/>
-          <w:szCs w:val="28"/>
-          <w:rtl w:val="0"/>
-        </w:rPr>
-        <w:t xml:space="preserve">i</w:t>
-      </w:r>
-      <w:r>
-        <w:rPr>
-          <w:rFonts w:ascii="Cambria" w:cs="Cambria" w:eastAsia="Cambria" w:hAnsi="Cambria"/>
-          <w:b w:val="1"/>
-          <w:i w:val="1"/>
-          <w:smallCaps w:val="0"/>
-          <w:strike w:val="0"/>
-          <w:color w:val="000000"/>
-          <w:sz w:val="28"/>
-          <w:szCs w:val="28"/>
-          <w:u w:val="none"/>
-          <w:shd w:fill="auto" w:val="clear"/>
-          <w:vertAlign w:val="baseline"/>
-          <w:rtl w:val="0"/>
-        </w:rPr>
-        <w:t xml:space="preserve">mplementación JAVA </w:t>
-      </w:r>
-    </w:p>
-    <w:p>
-      <w:pPr>
-        <w:rPr>
-          <w:rFonts w:ascii="Arial Narrow" w:cs="Arial Narrow" w:eastAsia="Arial Narrow" w:hAnsi="Arial Narrow"/>
-          <w:b w:val="0"/>
-          <w:sz w:val="22"/>
-          <w:szCs w:val="22"/>
-          <w:vertAlign w:val="baseline"/>
-        </w:rPr>
-      </w:pPr>
-      <w:r>
-        <w:rPr>
-          <w:rtl w:val="0"/>
-        </w:rPr>
-      </w:r>
-    </w:p>
-    <w:p>
-      <w:pPr>
-        <w:rPr>
-          <w:rFonts w:ascii="Arial Narrow" w:cs="Arial Narrow" w:eastAsia="Arial Narrow" w:hAnsi="Arial Narrow"/>
-          <w:sz w:val="22"/>
-          <w:szCs w:val="22"/>
-          <w:vertAlign w:val="baseline"/>
-        </w:rPr>
-      </w:pPr>
-      <w:r>
-        <w:rPr>
-          <w:rtl w:val="0"/>
-        </w:rPr>
-      </w:r>
-    </w:p>
-    <w:p>
-      <w:pPr>
-        <w:rPr>
-          <w:rFonts w:ascii="Arial Narrow" w:cs="Arial Narrow" w:eastAsia="Arial Narrow" w:hAnsi="Arial Narrow"/>
-          <w:b w:val="0"/>
-          <w:sz w:val="22"/>
-          <w:szCs w:val="22"/>
-          <w:vertAlign w:val="baseline"/>
-        </w:rPr>
-      </w:pPr>
-      <w:r>
-        <w:rPr>
-          <w:rFonts w:ascii="Arial Narrow" w:cs="Arial Narrow" w:eastAsia="Arial Narrow" w:hAnsi="Arial Narrow"/>
-          <w:b w:val="1"/>
-          <w:sz w:val="22"/>
-          <w:szCs w:val="22"/>
-          <w:vertAlign w:val="baseline"/>
-          <w:rtl w:val="0"/>
-        </w:rPr>
-        <w:t xml:space="preserve">REQUERIMIENTO</w:t>
-      </w:r>
-      <w:r>
-        <w:rPr>
-          <w:rtl w:val="0"/>
-        </w:rPr>
-      </w:r>
-    </w:p>
-    <w:p>
-      <w:pPr>
-        <w:rPr>
-          <w:rFonts w:ascii="Arial Narrow" w:cs="Arial Narrow" w:eastAsia="Arial Narrow" w:hAnsi="Arial Narrow"/>
-          <w:sz w:val="22"/>
-          <w:szCs w:val="22"/>
-          <w:vertAlign w:val="baseline"/>
-        </w:rPr>
-      </w:pPr>
-      <w:r>
-        <w:rPr>
-          <w:rFonts w:ascii="Arial Narrow" w:cs="Arial Narrow" w:eastAsia="Arial Narrow" w:hAnsi="Arial Narrow"/>
-          <w:sz w:val="22"/>
-          <w:szCs w:val="22"/>
-          <w:vertAlign w:val="baseline"/>
-          <w:rtl w:val="0"/>
-        </w:rPr>
-        <w:t xml:space="preserve">Construya un formulario con su correspondiente Base de datos que permita realizar una encuesta </w:t>
-      </w:r>
-      <w:r>
-        <w:rPr>
-          <w:rFonts w:ascii="Arial Narrow" w:cs="Arial Narrow" w:eastAsia="Arial Narrow" w:hAnsi="Arial Narrow"/>
-          <w:b w:val="1"/>
-          <w:sz w:val="22"/>
-          <w:szCs w:val="22"/>
-          <w:vertAlign w:val="baseline"/>
-          <w:rtl w:val="0"/>
-        </w:rPr>
-        <w:t xml:space="preserve">vía web, </w:t>
-      </w:r>
-      <w:r>
-        <w:rPr>
-          <w:rFonts w:ascii="Arial Narrow" w:cs="Arial Narrow" w:eastAsia="Arial Narrow" w:hAnsi="Arial Narrow"/>
-          <w:sz w:val="22"/>
-          <w:szCs w:val="22"/>
-          <w:vertAlign w:val="baseline"/>
-          <w:rtl w:val="0"/>
-        </w:rPr>
-        <w:t xml:space="preserve">con los siguientes campos (Nombre, apellido, marca de PC, fecha y hora de registro, email</w:t>
-      </w:r>
-      <w:r>
-        <w:rPr>
-          <w:rFonts w:ascii="Arial Narrow" w:cs="Arial Narrow" w:eastAsia="Arial Narrow" w:hAnsi="Arial Narrow"/>
-          <w:b w:val="1"/>
-          <w:sz w:val="22"/>
-          <w:szCs w:val="22"/>
-          <w:vertAlign w:val="baseline"/>
-          <w:rtl w:val="0"/>
-        </w:rPr>
-        <w:t xml:space="preserve">)</w:t>
-      </w:r>
-      <w:r>
-        <w:rPr>
-          <w:rFonts w:ascii="Arial Narrow" w:cs="Arial Narrow" w:eastAsia="Arial Narrow" w:hAnsi="Arial Narrow"/>
-          <w:sz w:val="22"/>
-          <w:szCs w:val="22"/>
-          <w:vertAlign w:val="baseline"/>
-          <w:rtl w:val="0"/>
-        </w:rPr>
-        <w:t xml:space="preserve">:</w:t>
-      </w:r>
-    </w:p>
-    <w:p>
-      <w:pPr>
-        <w:rPr>
-          <w:rFonts w:ascii="Arial Narrow" w:cs="Arial Narrow" w:eastAsia="Arial Narrow" w:hAnsi="Arial Narrow"/>
-          <w:sz w:val="22"/>
-          <w:szCs w:val="22"/>
-        </w:rPr>
-      </w:pPr>
-      <w:r>
-        <w:rPr>
           <w:rFonts w:ascii="Arial Narrow" w:cs="Arial Narrow" w:eastAsia="Arial Narrow" w:hAnsi="Arial Narrow"/>
           <w:sz w:val="22"/>
           <w:szCs w:val="22"/>
         </w:rPr>
         <w:drawing>
           <wp:inline distB="114300" distT="114300" distL="114300" distR="114300">
-            <wp:extent cx="5612130" cy="2857500"/>
+            <wp:extent cx="5612130" cy="2959100"/>
             <wp:effectExtent b="0" l="0" r="0" t="0"/>
             <wp:docPr id="5" name="image1.png"/>
             <a:graphic>
@@ -2116,6 +643,1518 @@
                   <pic:spPr>
                     <a:xfrm>
                       <a:off x="0" y="0"/>
+                      <a:ext cx="5612130" cy="2959100"/>
+                    </a:xfrm>
+                    <a:prstGeom prst="rect"/>
+                    <a:ln/>
+                  </pic:spPr>
+                </pic:pic>
+              </a:graphicData>
+            </a:graphic>
+          </wp:inline>
+        </w:drawing>
+      </w:r>
+      <w:r>
+        <w:rPr>
+          <w:rtl w:val="0"/>
+        </w:rPr>
+      </w:r>
+    </w:p>
+    <w:p>
+      <w:pPr>
+        <w:keepNext w:val="1"/>
+        <w:keepLines w:val="0"/>
+        <w:pageBreakBefore w:val="0"/>
+        <w:widowControl w:val="1"/>
+        <w:pBdr>
+          <w:top w:space="0" w:sz="0" w:val="nil"/>
+          <w:left w:space="0" w:sz="0" w:val="nil"/>
+          <w:bottom w:space="0" w:sz="0" w:val="nil"/>
+          <w:right w:space="0" w:sz="0" w:val="nil"/>
+          <w:between w:space="0" w:sz="0" w:val="nil"/>
+        </w:pBdr>
+        <w:shd w:fill="auto" w:val="clear"/>
+        <w:spacing w:after="60" w:before="240" w:line="240" w:lineRule="auto"/>
+        <w:ind w:left="0" w:right="0" w:firstLine="0"/>
+        <w:jc w:val="left"/>
+        <w:rPr>
+          <w:rFonts w:ascii="Cambria" w:cs="Cambria" w:eastAsia="Cambria" w:hAnsi="Cambria"/>
+          <w:b w:val="1"/>
+          <w:i w:val="1"/>
+          <w:smallCaps w:val="0"/>
+          <w:strike w:val="0"/>
+          <w:color w:val="000000"/>
+          <w:sz w:val="28"/>
+          <w:szCs w:val="28"/>
+          <w:u w:val="none"/>
+          <w:shd w:fill="auto" w:val="clear"/>
+          <w:vertAlign w:val="baseline"/>
+        </w:rPr>
+      </w:pPr>
+      <w:r>
+        <w:rPr>
+          <w:rFonts w:ascii="Cambria" w:cs="Cambria" w:eastAsia="Cambria" w:hAnsi="Cambria"/>
+          <w:b w:val="1"/>
+          <w:i w:val="1"/>
+          <w:smallCaps w:val="0"/>
+          <w:strike w:val="0"/>
+          <w:color w:val="000000"/>
+          <w:sz w:val="28"/>
+          <w:szCs w:val="28"/>
+          <w:u w:val="none"/>
+          <w:shd w:fill="auto" w:val="clear"/>
+          <w:vertAlign w:val="baseline"/>
+          <w:rtl w:val="0"/>
+        </w:rPr>
+        <w:t xml:space="preserve">2. Consideraciones de Diseño (Arquitectura)</w:t>
+      </w:r>
+    </w:p>
+    <w:p>
+      <w:pPr>
+        <w:rPr>
+          <w:rFonts w:ascii="Arial Narrow" w:cs="Arial Narrow" w:eastAsia="Arial Narrow" w:hAnsi="Arial Narrow"/>
+          <w:sz w:val="22"/>
+          <w:szCs w:val="22"/>
+          <w:vertAlign w:val="baseline"/>
+        </w:rPr>
+      </w:pPr>
+      <w:r>
+        <w:rPr>
+          <w:rtl w:val="0"/>
+        </w:rPr>
+      </w:r>
+    </w:p>
+    <w:p>
+      <w:pPr>
+        <w:rPr>
+          <w:rFonts w:ascii="Arial Narrow" w:cs="Arial Narrow" w:eastAsia="Arial Narrow" w:hAnsi="Arial Narrow"/>
+          <w:sz w:val="22"/>
+          <w:szCs w:val="22"/>
+          <w:vertAlign w:val="baseline"/>
+        </w:rPr>
+      </w:pPr>
+      <w:r>
+        <w:rPr>
+          <w:rFonts w:ascii="Arial Narrow" w:cs="Arial Narrow" w:eastAsia="Arial Narrow" w:hAnsi="Arial Narrow"/>
+          <w:sz w:val="22"/>
+          <w:szCs w:val="22"/>
+          <w:vertAlign w:val="baseline"/>
+          <w:rtl w:val="0"/>
+        </w:rPr>
+        <w:t xml:space="preserve">De acuerdo al enunciado del punto 1, presente un diseño general orientado a objetos, definiendo las clases y funciones necesarias, herencia y otros componentes que considere necesarios.</w:t>
+      </w:r>
+    </w:p>
+    <w:p>
+      <w:pPr>
+        <w:rPr>
+          <w:rFonts w:ascii="Arial Narrow" w:cs="Arial Narrow" w:eastAsia="Arial Narrow" w:hAnsi="Arial Narrow"/>
+          <w:sz w:val="22"/>
+          <w:szCs w:val="22"/>
+        </w:rPr>
+      </w:pPr>
+      <w:bookmarkStart w:colFirst="0" w:colLast="0" w:name="_heading=h.xycjpsutvv4z" w:id="0"/>
+      <w:bookmarkEnd w:id="0"/>
+      <w:r>
+        <w:rPr>
+          <w:rtl w:val="0"/>
+        </w:rPr>
+      </w:r>
+    </w:p>
+    <w:p>
+      <w:pPr>
+        <w:rPr>
+          <w:rFonts w:ascii="Arial Narrow" w:cs="Arial Narrow" w:eastAsia="Arial Narrow" w:hAnsi="Arial Narrow"/>
+          <w:sz w:val="22"/>
+          <w:szCs w:val="22"/>
+        </w:rPr>
+      </w:pPr>
+      <w:bookmarkStart w:colFirst="0" w:colLast="0" w:name="_heading=h.gjdgxs" w:id="1"/>
+      <w:bookmarkEnd w:id="1"/>
+      <w:r>
+        <w:rPr>
+          <w:rFonts w:ascii="Arial Narrow" w:cs="Arial Narrow" w:eastAsia="Arial Narrow" w:hAnsi="Arial Narrow"/>
+          <w:sz w:val="22"/>
+          <w:szCs w:val="22"/>
+          <w:rtl w:val="0"/>
+        </w:rPr>
+        <w:t xml:space="preserve">clases:</w:t>
+      </w:r>
+    </w:p>
+    <w:p>
+      <w:pPr>
+        <w:numPr>
+          <w:ilvl w:val="1"/>
+          <w:numId w:val="3"/>
+        </w:numPr>
+        <w:ind w:left="1440" w:hanging="360"/>
+        <w:rPr>
+          <w:rFonts w:ascii="Arial Narrow" w:cs="Arial Narrow" w:eastAsia="Arial Narrow" w:hAnsi="Arial Narrow"/>
+          <w:sz w:val="22"/>
+          <w:szCs w:val="22"/>
+        </w:rPr>
+      </w:pPr>
+      <w:r>
+        <w:rPr>
+          <w:rFonts w:ascii="Arial Narrow" w:cs="Arial Narrow" w:eastAsia="Arial Narrow" w:hAnsi="Arial Narrow"/>
+          <w:sz w:val="22"/>
+          <w:szCs w:val="22"/>
+          <w:rtl w:val="0"/>
+        </w:rPr>
+        <w:t xml:space="preserve">clase trámites</w:t>
+      </w:r>
+    </w:p>
+    <w:p>
+      <w:pPr>
+        <w:numPr>
+          <w:ilvl w:val="2"/>
+          <w:numId w:val="3"/>
+        </w:numPr>
+        <w:ind w:left="2160" w:hanging="360"/>
+        <w:rPr>
+          <w:rFonts w:ascii="Arial Narrow" w:cs="Arial Narrow" w:eastAsia="Arial Narrow" w:hAnsi="Arial Narrow"/>
+          <w:sz w:val="22"/>
+          <w:szCs w:val="22"/>
+        </w:rPr>
+      </w:pPr>
+      <w:r>
+        <w:rPr>
+          <w:rFonts w:ascii="Arial Narrow" w:cs="Arial Narrow" w:eastAsia="Arial Narrow" w:hAnsi="Arial Narrow"/>
+          <w:sz w:val="22"/>
+          <w:szCs w:val="22"/>
+          <w:rtl w:val="0"/>
+        </w:rPr>
+        <w:t xml:space="preserve">nombre</w:t>
+      </w:r>
+    </w:p>
+    <w:p>
+      <w:pPr>
+        <w:numPr>
+          <w:ilvl w:val="2"/>
+          <w:numId w:val="3"/>
+        </w:numPr>
+        <w:ind w:left="2160" w:hanging="360"/>
+        <w:rPr>
+          <w:rFonts w:ascii="Arial Narrow" w:cs="Arial Narrow" w:eastAsia="Arial Narrow" w:hAnsi="Arial Narrow"/>
+          <w:sz w:val="22"/>
+          <w:szCs w:val="22"/>
+        </w:rPr>
+      </w:pPr>
+      <w:r>
+        <w:rPr>
+          <w:rFonts w:ascii="Arial Narrow" w:cs="Arial Narrow" w:eastAsia="Arial Narrow" w:hAnsi="Arial Narrow"/>
+          <w:sz w:val="22"/>
+          <w:szCs w:val="22"/>
+          <w:rtl w:val="0"/>
+        </w:rPr>
+        <w:t xml:space="preserve">descripción</w:t>
+      </w:r>
+    </w:p>
+    <w:p>
+      <w:pPr>
+        <w:numPr>
+          <w:ilvl w:val="2"/>
+          <w:numId w:val="3"/>
+        </w:numPr>
+        <w:ind w:left="2160" w:hanging="360"/>
+        <w:rPr>
+          <w:rFonts w:ascii="Arial Narrow" w:cs="Arial Narrow" w:eastAsia="Arial Narrow" w:hAnsi="Arial Narrow"/>
+          <w:sz w:val="22"/>
+          <w:szCs w:val="22"/>
+        </w:rPr>
+      </w:pPr>
+      <w:r>
+        <w:rPr>
+          <w:rFonts w:ascii="Arial Narrow" w:cs="Arial Narrow" w:eastAsia="Arial Narrow" w:hAnsi="Arial Narrow"/>
+          <w:sz w:val="22"/>
+          <w:szCs w:val="22"/>
+          <w:rtl w:val="0"/>
+        </w:rPr>
+        <w:t xml:space="preserve">fecha de radicado</w:t>
+      </w:r>
+    </w:p>
+    <w:p>
+      <w:pPr>
+        <w:numPr>
+          <w:ilvl w:val="2"/>
+          <w:numId w:val="3"/>
+        </w:numPr>
+        <w:ind w:left="2160" w:hanging="360"/>
+        <w:rPr>
+          <w:rFonts w:ascii="Arial Narrow" w:cs="Arial Narrow" w:eastAsia="Arial Narrow" w:hAnsi="Arial Narrow"/>
+          <w:sz w:val="22"/>
+          <w:szCs w:val="22"/>
+        </w:rPr>
+      </w:pPr>
+      <w:r>
+        <w:rPr>
+          <w:rFonts w:ascii="Arial Narrow" w:cs="Arial Narrow" w:eastAsia="Arial Narrow" w:hAnsi="Arial Narrow"/>
+          <w:sz w:val="22"/>
+          <w:szCs w:val="22"/>
+          <w:rtl w:val="0"/>
+        </w:rPr>
+        <w:t xml:space="preserve">estado del trámite</w:t>
+      </w:r>
+    </w:p>
+    <w:p>
+      <w:pPr>
+        <w:numPr>
+          <w:ilvl w:val="2"/>
+          <w:numId w:val="3"/>
+        </w:numPr>
+        <w:ind w:left="2160" w:hanging="360"/>
+        <w:rPr>
+          <w:rFonts w:ascii="Arial Narrow" w:cs="Arial Narrow" w:eastAsia="Arial Narrow" w:hAnsi="Arial Narrow"/>
+          <w:sz w:val="22"/>
+          <w:szCs w:val="22"/>
+        </w:rPr>
+      </w:pPr>
+      <w:r>
+        <w:rPr>
+          <w:rFonts w:ascii="Arial Narrow" w:cs="Arial Narrow" w:eastAsia="Arial Narrow" w:hAnsi="Arial Narrow"/>
+          <w:sz w:val="22"/>
+          <w:szCs w:val="22"/>
+          <w:rtl w:val="0"/>
+        </w:rPr>
+        <w:t xml:space="preserve">quien radica</w:t>
+      </w:r>
+    </w:p>
+    <w:p>
+      <w:pPr>
+        <w:numPr>
+          <w:ilvl w:val="2"/>
+          <w:numId w:val="3"/>
+        </w:numPr>
+        <w:ind w:left="2160" w:hanging="360"/>
+        <w:rPr>
+          <w:rFonts w:ascii="Arial Narrow" w:cs="Arial Narrow" w:eastAsia="Arial Narrow" w:hAnsi="Arial Narrow"/>
+          <w:sz w:val="22"/>
+          <w:szCs w:val="22"/>
+        </w:rPr>
+      </w:pPr>
+      <w:r>
+        <w:rPr>
+          <w:rFonts w:ascii="Arial Narrow" w:cs="Arial Narrow" w:eastAsia="Arial Narrow" w:hAnsi="Arial Narrow"/>
+          <w:sz w:val="22"/>
+          <w:szCs w:val="22"/>
+          <w:rtl w:val="0"/>
+        </w:rPr>
+        <w:t xml:space="preserve">quien atiende</w:t>
+      </w:r>
+    </w:p>
+    <w:p>
+      <w:pPr>
+        <w:numPr>
+          <w:ilvl w:val="2"/>
+          <w:numId w:val="3"/>
+        </w:numPr>
+        <w:ind w:left="2160" w:hanging="360"/>
+        <w:rPr>
+          <w:rFonts w:ascii="Arial Narrow" w:cs="Arial Narrow" w:eastAsia="Arial Narrow" w:hAnsi="Arial Narrow"/>
+          <w:sz w:val="22"/>
+          <w:szCs w:val="22"/>
+        </w:rPr>
+      </w:pPr>
+      <w:r>
+        <w:rPr>
+          <w:rFonts w:ascii="Arial Narrow" w:cs="Arial Narrow" w:eastAsia="Arial Narrow" w:hAnsi="Arial Narrow"/>
+          <w:sz w:val="22"/>
+          <w:szCs w:val="22"/>
+          <w:rtl w:val="0"/>
+        </w:rPr>
+        <w:t xml:space="preserve">historial de modificaciones</w:t>
+      </w:r>
+    </w:p>
+    <w:p>
+      <w:pPr>
+        <w:numPr>
+          <w:ilvl w:val="2"/>
+          <w:numId w:val="3"/>
+        </w:numPr>
+        <w:ind w:left="2160" w:hanging="360"/>
+        <w:rPr>
+          <w:rFonts w:ascii="Arial Narrow" w:cs="Arial Narrow" w:eastAsia="Arial Narrow" w:hAnsi="Arial Narrow"/>
+          <w:sz w:val="22"/>
+          <w:szCs w:val="22"/>
+        </w:rPr>
+      </w:pPr>
+      <w:r>
+        <w:rPr>
+          <w:rFonts w:ascii="Arial Narrow" w:cs="Arial Narrow" w:eastAsia="Arial Narrow" w:hAnsi="Arial Narrow"/>
+          <w:sz w:val="22"/>
+          <w:szCs w:val="22"/>
+          <w:rtl w:val="0"/>
+        </w:rPr>
+        <w:t xml:space="preserve">Numero+año de radicación</w:t>
+      </w:r>
+    </w:p>
+    <w:p>
+      <w:pPr>
+        <w:numPr>
+          <w:ilvl w:val="1"/>
+          <w:numId w:val="3"/>
+        </w:numPr>
+        <w:ind w:left="1440" w:hanging="360"/>
+        <w:rPr>
+          <w:rFonts w:ascii="Arial Narrow" w:cs="Arial Narrow" w:eastAsia="Arial Narrow" w:hAnsi="Arial Narrow"/>
+          <w:sz w:val="22"/>
+          <w:szCs w:val="22"/>
+        </w:rPr>
+      </w:pPr>
+      <w:r>
+        <w:rPr>
+          <w:rFonts w:ascii="Arial Narrow" w:cs="Arial Narrow" w:eastAsia="Arial Narrow" w:hAnsi="Arial Narrow"/>
+          <w:sz w:val="22"/>
+          <w:szCs w:val="22"/>
+          <w:rtl w:val="0"/>
+        </w:rPr>
+        <w:t xml:space="preserve">clase persona</w:t>
+      </w:r>
+    </w:p>
+    <w:p>
+      <w:pPr>
+        <w:numPr>
+          <w:ilvl w:val="2"/>
+          <w:numId w:val="3"/>
+        </w:numPr>
+        <w:ind w:left="2160" w:hanging="360"/>
+        <w:rPr>
+          <w:rFonts w:ascii="Arial Narrow" w:cs="Arial Narrow" w:eastAsia="Arial Narrow" w:hAnsi="Arial Narrow"/>
+          <w:sz w:val="22"/>
+          <w:szCs w:val="22"/>
+        </w:rPr>
+      </w:pPr>
+      <w:r>
+        <w:rPr>
+          <w:rFonts w:ascii="Arial Narrow" w:cs="Arial Narrow" w:eastAsia="Arial Narrow" w:hAnsi="Arial Narrow"/>
+          <w:sz w:val="22"/>
+          <w:szCs w:val="22"/>
+          <w:rtl w:val="0"/>
+        </w:rPr>
+        <w:t xml:space="preserve">tipo de identificación</w:t>
+      </w:r>
+    </w:p>
+    <w:p>
+      <w:pPr>
+        <w:numPr>
+          <w:ilvl w:val="2"/>
+          <w:numId w:val="3"/>
+        </w:numPr>
+        <w:ind w:left="2160" w:hanging="360"/>
+        <w:rPr>
+          <w:rFonts w:ascii="Arial Narrow" w:cs="Arial Narrow" w:eastAsia="Arial Narrow" w:hAnsi="Arial Narrow"/>
+          <w:sz w:val="22"/>
+          <w:szCs w:val="22"/>
+        </w:rPr>
+      </w:pPr>
+      <w:r>
+        <w:rPr>
+          <w:rFonts w:ascii="Arial Narrow" w:cs="Arial Narrow" w:eastAsia="Arial Narrow" w:hAnsi="Arial Narrow"/>
+          <w:sz w:val="22"/>
+          <w:szCs w:val="22"/>
+          <w:rtl w:val="0"/>
+        </w:rPr>
+        <w:t xml:space="preserve">numero de identificación</w:t>
+      </w:r>
+    </w:p>
+    <w:p>
+      <w:pPr>
+        <w:numPr>
+          <w:ilvl w:val="2"/>
+          <w:numId w:val="3"/>
+        </w:numPr>
+        <w:ind w:left="2160" w:hanging="360"/>
+        <w:rPr>
+          <w:rFonts w:ascii="Arial Narrow" w:cs="Arial Narrow" w:eastAsia="Arial Narrow" w:hAnsi="Arial Narrow"/>
+          <w:sz w:val="22"/>
+          <w:szCs w:val="22"/>
+        </w:rPr>
+      </w:pPr>
+      <w:r>
+        <w:rPr>
+          <w:rFonts w:ascii="Arial Narrow" w:cs="Arial Narrow" w:eastAsia="Arial Narrow" w:hAnsi="Arial Narrow"/>
+          <w:sz w:val="22"/>
+          <w:szCs w:val="22"/>
+          <w:rtl w:val="0"/>
+        </w:rPr>
+        <w:t xml:space="preserve">nombres</w:t>
+      </w:r>
+    </w:p>
+    <w:p>
+      <w:pPr>
+        <w:numPr>
+          <w:ilvl w:val="2"/>
+          <w:numId w:val="3"/>
+        </w:numPr>
+        <w:ind w:left="2160" w:hanging="360"/>
+        <w:rPr>
+          <w:rFonts w:ascii="Arial Narrow" w:cs="Arial Narrow" w:eastAsia="Arial Narrow" w:hAnsi="Arial Narrow"/>
+          <w:sz w:val="22"/>
+          <w:szCs w:val="22"/>
+        </w:rPr>
+      </w:pPr>
+      <w:r>
+        <w:rPr>
+          <w:rFonts w:ascii="Arial Narrow" w:cs="Arial Narrow" w:eastAsia="Arial Narrow" w:hAnsi="Arial Narrow"/>
+          <w:sz w:val="22"/>
+          <w:szCs w:val="22"/>
+          <w:rtl w:val="0"/>
+        </w:rPr>
+        <w:t xml:space="preserve">apellidos</w:t>
+      </w:r>
+    </w:p>
+    <w:p>
+      <w:pPr>
+        <w:numPr>
+          <w:ilvl w:val="2"/>
+          <w:numId w:val="3"/>
+        </w:numPr>
+        <w:ind w:left="2160" w:hanging="360"/>
+        <w:rPr>
+          <w:rFonts w:ascii="Arial Narrow" w:cs="Arial Narrow" w:eastAsia="Arial Narrow" w:hAnsi="Arial Narrow"/>
+          <w:sz w:val="22"/>
+          <w:szCs w:val="22"/>
+        </w:rPr>
+      </w:pPr>
+      <w:r>
+        <w:rPr>
+          <w:rFonts w:ascii="Arial Narrow" w:cs="Arial Narrow" w:eastAsia="Arial Narrow" w:hAnsi="Arial Narrow"/>
+          <w:sz w:val="22"/>
+          <w:szCs w:val="22"/>
+          <w:rtl w:val="0"/>
+        </w:rPr>
+        <w:t xml:space="preserve">telefono</w:t>
+      </w:r>
+    </w:p>
+    <w:p>
+      <w:pPr>
+        <w:numPr>
+          <w:ilvl w:val="2"/>
+          <w:numId w:val="3"/>
+        </w:numPr>
+        <w:ind w:left="2160" w:hanging="360"/>
+        <w:rPr>
+          <w:rFonts w:ascii="Arial Narrow" w:cs="Arial Narrow" w:eastAsia="Arial Narrow" w:hAnsi="Arial Narrow"/>
+          <w:sz w:val="22"/>
+          <w:szCs w:val="22"/>
+        </w:rPr>
+      </w:pPr>
+      <w:r>
+        <w:rPr>
+          <w:rFonts w:ascii="Arial Narrow" w:cs="Arial Narrow" w:eastAsia="Arial Narrow" w:hAnsi="Arial Narrow"/>
+          <w:sz w:val="22"/>
+          <w:szCs w:val="22"/>
+          <w:rtl w:val="0"/>
+        </w:rPr>
+        <w:t xml:space="preserve">direccion</w:t>
+      </w:r>
+    </w:p>
+    <w:p>
+      <w:pPr>
+        <w:numPr>
+          <w:ilvl w:val="2"/>
+          <w:numId w:val="3"/>
+        </w:numPr>
+        <w:ind w:left="2160" w:hanging="360"/>
+        <w:rPr>
+          <w:rFonts w:ascii="Arial Narrow" w:cs="Arial Narrow" w:eastAsia="Arial Narrow" w:hAnsi="Arial Narrow"/>
+          <w:sz w:val="22"/>
+          <w:szCs w:val="22"/>
+        </w:rPr>
+      </w:pPr>
+      <w:r>
+        <w:rPr>
+          <w:rFonts w:ascii="Arial Narrow" w:cs="Arial Narrow" w:eastAsia="Arial Narrow" w:hAnsi="Arial Narrow"/>
+          <w:sz w:val="22"/>
+          <w:szCs w:val="22"/>
+          <w:rtl w:val="0"/>
+        </w:rPr>
+        <w:t xml:space="preserve">correo electrónico</w:t>
+      </w:r>
+    </w:p>
+    <w:p>
+      <w:pPr>
+        <w:numPr>
+          <w:ilvl w:val="1"/>
+          <w:numId w:val="3"/>
+        </w:numPr>
+        <w:ind w:left="1440" w:hanging="360"/>
+        <w:rPr>
+          <w:rFonts w:ascii="Arial Narrow" w:cs="Arial Narrow" w:eastAsia="Arial Narrow" w:hAnsi="Arial Narrow"/>
+          <w:sz w:val="22"/>
+          <w:szCs w:val="22"/>
+        </w:rPr>
+      </w:pPr>
+      <w:r>
+        <w:rPr>
+          <w:rFonts w:ascii="Arial Narrow" w:cs="Arial Narrow" w:eastAsia="Arial Narrow" w:hAnsi="Arial Narrow"/>
+          <w:sz w:val="22"/>
+          <w:szCs w:val="22"/>
+          <w:rtl w:val="0"/>
+        </w:rPr>
+        <w:t xml:space="preserve">clase Empleado</w:t>
+      </w:r>
+    </w:p>
+    <w:p>
+      <w:pPr>
+        <w:numPr>
+          <w:ilvl w:val="2"/>
+          <w:numId w:val="3"/>
+        </w:numPr>
+        <w:ind w:left="2160" w:hanging="360"/>
+        <w:rPr>
+          <w:rFonts w:ascii="Arial Narrow" w:cs="Arial Narrow" w:eastAsia="Arial Narrow" w:hAnsi="Arial Narrow"/>
+          <w:sz w:val="22"/>
+          <w:szCs w:val="22"/>
+        </w:rPr>
+      </w:pPr>
+      <w:r>
+        <w:rPr>
+          <w:rFonts w:ascii="Arial Narrow" w:cs="Arial Narrow" w:eastAsia="Arial Narrow" w:hAnsi="Arial Narrow"/>
+          <w:sz w:val="22"/>
+          <w:szCs w:val="22"/>
+          <w:rtl w:val="0"/>
+        </w:rPr>
+        <w:t xml:space="preserve">hereda de persona</w:t>
+      </w:r>
+    </w:p>
+    <w:p>
+      <w:pPr>
+        <w:numPr>
+          <w:ilvl w:val="2"/>
+          <w:numId w:val="3"/>
+        </w:numPr>
+        <w:ind w:left="2160" w:hanging="360"/>
+        <w:rPr>
+          <w:rFonts w:ascii="Arial Narrow" w:cs="Arial Narrow" w:eastAsia="Arial Narrow" w:hAnsi="Arial Narrow"/>
+          <w:sz w:val="22"/>
+          <w:szCs w:val="22"/>
+        </w:rPr>
+      </w:pPr>
+      <w:r>
+        <w:rPr>
+          <w:rFonts w:ascii="Arial Narrow" w:cs="Arial Narrow" w:eastAsia="Arial Narrow" w:hAnsi="Arial Narrow"/>
+          <w:sz w:val="22"/>
+          <w:szCs w:val="22"/>
+          <w:rtl w:val="0"/>
+        </w:rPr>
+        <w:t xml:space="preserve">dependencia</w:t>
+      </w:r>
+    </w:p>
+    <w:p>
+      <w:pPr>
+        <w:numPr>
+          <w:ilvl w:val="2"/>
+          <w:numId w:val="3"/>
+        </w:numPr>
+        <w:ind w:left="2160" w:hanging="360"/>
+        <w:rPr>
+          <w:rFonts w:ascii="Arial Narrow" w:cs="Arial Narrow" w:eastAsia="Arial Narrow" w:hAnsi="Arial Narrow"/>
+          <w:sz w:val="22"/>
+          <w:szCs w:val="22"/>
+        </w:rPr>
+      </w:pPr>
+      <w:r>
+        <w:rPr>
+          <w:rFonts w:ascii="Arial Narrow" w:cs="Arial Narrow" w:eastAsia="Arial Narrow" w:hAnsi="Arial Narrow"/>
+          <w:sz w:val="22"/>
+          <w:szCs w:val="22"/>
+          <w:rtl w:val="0"/>
+        </w:rPr>
+        <w:t xml:space="preserve">fecha de ingreso</w:t>
+      </w:r>
+    </w:p>
+    <w:p>
+      <w:pPr>
+        <w:numPr>
+          <w:ilvl w:val="1"/>
+          <w:numId w:val="3"/>
+        </w:numPr>
+        <w:ind w:left="1440" w:hanging="360"/>
+        <w:rPr>
+          <w:rFonts w:ascii="Arial Narrow" w:cs="Arial Narrow" w:eastAsia="Arial Narrow" w:hAnsi="Arial Narrow"/>
+          <w:sz w:val="22"/>
+          <w:szCs w:val="22"/>
+        </w:rPr>
+      </w:pPr>
+      <w:r>
+        <w:rPr>
+          <w:rFonts w:ascii="Arial Narrow" w:cs="Arial Narrow" w:eastAsia="Arial Narrow" w:hAnsi="Arial Narrow"/>
+          <w:sz w:val="22"/>
+          <w:szCs w:val="22"/>
+          <w:rtl w:val="0"/>
+        </w:rPr>
+        <w:t xml:space="preserve">clase Usuario</w:t>
+      </w:r>
+    </w:p>
+    <w:p>
+      <w:pPr>
+        <w:numPr>
+          <w:ilvl w:val="2"/>
+          <w:numId w:val="3"/>
+        </w:numPr>
+        <w:ind w:left="2160" w:hanging="360"/>
+        <w:rPr>
+          <w:rFonts w:ascii="Arial Narrow" w:cs="Arial Narrow" w:eastAsia="Arial Narrow" w:hAnsi="Arial Narrow"/>
+          <w:sz w:val="22"/>
+          <w:szCs w:val="22"/>
+        </w:rPr>
+      </w:pPr>
+      <w:r>
+        <w:rPr>
+          <w:rFonts w:ascii="Arial Narrow" w:cs="Arial Narrow" w:eastAsia="Arial Narrow" w:hAnsi="Arial Narrow"/>
+          <w:sz w:val="22"/>
+          <w:szCs w:val="22"/>
+          <w:rtl w:val="0"/>
+        </w:rPr>
+        <w:t xml:space="preserve">identificador</w:t>
+      </w:r>
+    </w:p>
+    <w:p>
+      <w:pPr>
+        <w:numPr>
+          <w:ilvl w:val="2"/>
+          <w:numId w:val="3"/>
+        </w:numPr>
+        <w:ind w:left="2160" w:hanging="360"/>
+        <w:rPr>
+          <w:rFonts w:ascii="Arial Narrow" w:cs="Arial Narrow" w:eastAsia="Arial Narrow" w:hAnsi="Arial Narrow"/>
+          <w:sz w:val="22"/>
+          <w:szCs w:val="22"/>
+        </w:rPr>
+      </w:pPr>
+      <w:r>
+        <w:rPr>
+          <w:rFonts w:ascii="Arial Narrow" w:cs="Arial Narrow" w:eastAsia="Arial Narrow" w:hAnsi="Arial Narrow"/>
+          <w:sz w:val="22"/>
+          <w:szCs w:val="22"/>
+          <w:rtl w:val="0"/>
+        </w:rPr>
+        <w:t xml:space="preserve">Nombre de usuario</w:t>
+      </w:r>
+    </w:p>
+    <w:p>
+      <w:pPr>
+        <w:numPr>
+          <w:ilvl w:val="2"/>
+          <w:numId w:val="3"/>
+        </w:numPr>
+        <w:ind w:left="2160" w:hanging="360"/>
+        <w:rPr>
+          <w:rFonts w:ascii="Arial Narrow" w:cs="Arial Narrow" w:eastAsia="Arial Narrow" w:hAnsi="Arial Narrow"/>
+          <w:sz w:val="22"/>
+          <w:szCs w:val="22"/>
+        </w:rPr>
+      </w:pPr>
+      <w:r>
+        <w:rPr>
+          <w:rFonts w:ascii="Arial Narrow" w:cs="Arial Narrow" w:eastAsia="Arial Narrow" w:hAnsi="Arial Narrow"/>
+          <w:sz w:val="22"/>
+          <w:szCs w:val="22"/>
+          <w:rtl w:val="0"/>
+        </w:rPr>
+        <w:t xml:space="preserve">password</w:t>
+      </w:r>
+    </w:p>
+    <w:p>
+      <w:pPr>
+        <w:numPr>
+          <w:ilvl w:val="2"/>
+          <w:numId w:val="3"/>
+        </w:numPr>
+        <w:ind w:left="2160" w:hanging="360"/>
+        <w:rPr>
+          <w:rFonts w:ascii="Arial Narrow" w:cs="Arial Narrow" w:eastAsia="Arial Narrow" w:hAnsi="Arial Narrow"/>
+          <w:sz w:val="22"/>
+          <w:szCs w:val="22"/>
+        </w:rPr>
+      </w:pPr>
+      <w:r>
+        <w:rPr>
+          <w:rFonts w:ascii="Arial Narrow" w:cs="Arial Narrow" w:eastAsia="Arial Narrow" w:hAnsi="Arial Narrow"/>
+          <w:sz w:val="22"/>
+          <w:szCs w:val="22"/>
+          <w:rtl w:val="0"/>
+        </w:rPr>
+        <w:t xml:space="preserve">rol</w:t>
+      </w:r>
+    </w:p>
+    <w:p>
+      <w:pPr>
+        <w:numPr>
+          <w:ilvl w:val="1"/>
+          <w:numId w:val="3"/>
+        </w:numPr>
+        <w:ind w:left="1440" w:hanging="360"/>
+        <w:rPr>
+          <w:rFonts w:ascii="Arial Narrow" w:cs="Arial Narrow" w:eastAsia="Arial Narrow" w:hAnsi="Arial Narrow"/>
+          <w:sz w:val="22"/>
+          <w:szCs w:val="22"/>
+        </w:rPr>
+      </w:pPr>
+      <w:r>
+        <w:rPr>
+          <w:rFonts w:ascii="Arial Narrow" w:cs="Arial Narrow" w:eastAsia="Arial Narrow" w:hAnsi="Arial Narrow"/>
+          <w:sz w:val="22"/>
+          <w:szCs w:val="22"/>
+          <w:rtl w:val="0"/>
+        </w:rPr>
+        <w:t xml:space="preserve">clase sistema</w:t>
+      </w:r>
+    </w:p>
+    <w:p>
+      <w:pPr>
+        <w:numPr>
+          <w:ilvl w:val="2"/>
+          <w:numId w:val="3"/>
+        </w:numPr>
+        <w:ind w:left="2160" w:hanging="360"/>
+        <w:rPr>
+          <w:rFonts w:ascii="Arial Narrow" w:cs="Arial Narrow" w:eastAsia="Arial Narrow" w:hAnsi="Arial Narrow"/>
+          <w:sz w:val="22"/>
+          <w:szCs w:val="22"/>
+        </w:rPr>
+      </w:pPr>
+      <w:r>
+        <w:rPr>
+          <w:rFonts w:ascii="Arial Narrow" w:cs="Arial Narrow" w:eastAsia="Arial Narrow" w:hAnsi="Arial Narrow"/>
+          <w:sz w:val="22"/>
+          <w:szCs w:val="22"/>
+          <w:rtl w:val="0"/>
+        </w:rPr>
+        <w:t xml:space="preserve">padre o clase principal que gestionaría la interacción  entre las otras clases</w:t>
+      </w:r>
+    </w:p>
+    <w:p>
+      <w:pPr>
+        <w:ind w:left="720" w:firstLine="0"/>
+        <w:rPr>
+          <w:rFonts w:ascii="Arial Narrow" w:cs="Arial Narrow" w:eastAsia="Arial Narrow" w:hAnsi="Arial Narrow"/>
+          <w:sz w:val="22"/>
+          <w:szCs w:val="22"/>
+        </w:rPr>
+      </w:pPr>
+      <w:r>
+        <w:rPr>
+          <w:rtl w:val="0"/>
+        </w:rPr>
+      </w:r>
+    </w:p>
+    <w:p>
+      <w:pPr>
+        <w:rPr>
+          <w:rFonts w:ascii="Arial Narrow" w:cs="Arial Narrow" w:eastAsia="Arial Narrow" w:hAnsi="Arial Narrow"/>
+          <w:sz w:val="22"/>
+          <w:szCs w:val="22"/>
+        </w:rPr>
+      </w:pPr>
+      <w:bookmarkStart w:colFirst="0" w:colLast="0" w:name="_heading=h.uj5tgtd3g753" w:id="2"/>
+      <w:bookmarkEnd w:id="2"/>
+      <w:r>
+        <w:rPr>
+          <w:rFonts w:ascii="Arial Narrow" w:cs="Arial Narrow" w:eastAsia="Arial Narrow" w:hAnsi="Arial Narrow"/>
+          <w:sz w:val="22"/>
+          <w:szCs w:val="22"/>
+          <w:rtl w:val="0"/>
+        </w:rPr>
+        <w:t xml:space="preserve">funciones:</w:t>
+      </w:r>
+    </w:p>
+    <w:p>
+      <w:pPr>
+        <w:numPr>
+          <w:ilvl w:val="0"/>
+          <w:numId w:val="1"/>
+        </w:numPr>
+        <w:ind w:left="720" w:hanging="360"/>
+        <w:rPr>
+          <w:rFonts w:ascii="Arial Narrow" w:cs="Arial Narrow" w:eastAsia="Arial Narrow" w:hAnsi="Arial Narrow"/>
+          <w:sz w:val="22"/>
+          <w:szCs w:val="22"/>
+          <w:u w:val="none"/>
+        </w:rPr>
+      </w:pPr>
+      <w:bookmarkStart w:colFirst="0" w:colLast="0" w:name="_heading=h.dyd754jsgrpt" w:id="3"/>
+      <w:bookmarkEnd w:id="3"/>
+      <w:r>
+        <w:rPr>
+          <w:rFonts w:ascii="Arial Narrow" w:cs="Arial Narrow" w:eastAsia="Arial Narrow" w:hAnsi="Arial Narrow"/>
+          <w:sz w:val="22"/>
+          <w:szCs w:val="22"/>
+          <w:rtl w:val="0"/>
+        </w:rPr>
+        <w:t xml:space="preserve">registro del tŕamite (POST,CREATE)</w:t>
+      </w:r>
+    </w:p>
+    <w:p>
+      <w:pPr>
+        <w:numPr>
+          <w:ilvl w:val="0"/>
+          <w:numId w:val="1"/>
+        </w:numPr>
+        <w:ind w:left="720" w:hanging="360"/>
+        <w:rPr>
+          <w:rFonts w:ascii="Arial Narrow" w:cs="Arial Narrow" w:eastAsia="Arial Narrow" w:hAnsi="Arial Narrow"/>
+          <w:sz w:val="22"/>
+          <w:szCs w:val="22"/>
+          <w:u w:val="none"/>
+        </w:rPr>
+      </w:pPr>
+      <w:bookmarkStart w:colFirst="0" w:colLast="0" w:name="_heading=h.gmm724cdsrc1" w:id="4"/>
+      <w:bookmarkEnd w:id="4"/>
+      <w:r>
+        <w:rPr>
+          <w:rFonts w:ascii="Arial Narrow" w:cs="Arial Narrow" w:eastAsia="Arial Narrow" w:hAnsi="Arial Narrow"/>
+          <w:sz w:val="22"/>
+          <w:szCs w:val="22"/>
+          <w:rtl w:val="0"/>
+        </w:rPr>
+        <w:t xml:space="preserve">consulta del tramite (GET, READ)</w:t>
+      </w:r>
+    </w:p>
+    <w:p>
+      <w:pPr>
+        <w:numPr>
+          <w:ilvl w:val="0"/>
+          <w:numId w:val="1"/>
+        </w:numPr>
+        <w:ind w:left="720" w:hanging="360"/>
+        <w:rPr>
+          <w:rFonts w:ascii="Arial Narrow" w:cs="Arial Narrow" w:eastAsia="Arial Narrow" w:hAnsi="Arial Narrow"/>
+          <w:sz w:val="22"/>
+          <w:szCs w:val="22"/>
+          <w:u w:val="none"/>
+        </w:rPr>
+      </w:pPr>
+      <w:bookmarkStart w:colFirst="0" w:colLast="0" w:name="_heading=h.8fvq6yvlplx3" w:id="5"/>
+      <w:bookmarkEnd w:id="5"/>
+      <w:r>
+        <w:rPr>
+          <w:rFonts w:ascii="Arial Narrow" w:cs="Arial Narrow" w:eastAsia="Arial Narrow" w:hAnsi="Arial Narrow"/>
+          <w:sz w:val="22"/>
+          <w:szCs w:val="22"/>
+          <w:rtl w:val="0"/>
+        </w:rPr>
+        <w:t xml:space="preserve">editar tramite (PUT,EDIT, PATCH,UPDATE)</w:t>
+      </w:r>
+    </w:p>
+    <w:p>
+      <w:pPr>
+        <w:numPr>
+          <w:ilvl w:val="0"/>
+          <w:numId w:val="1"/>
+        </w:numPr>
+        <w:ind w:left="720" w:hanging="360"/>
+        <w:rPr>
+          <w:rFonts w:ascii="Arial Narrow" w:cs="Arial Narrow" w:eastAsia="Arial Narrow" w:hAnsi="Arial Narrow"/>
+          <w:sz w:val="22"/>
+          <w:szCs w:val="22"/>
+          <w:u w:val="none"/>
+        </w:rPr>
+      </w:pPr>
+      <w:bookmarkStart w:colFirst="0" w:colLast="0" w:name="_heading=h.lk0g3a3mwnqz" w:id="6"/>
+      <w:bookmarkEnd w:id="6"/>
+      <w:r>
+        <w:rPr>
+          <w:rFonts w:ascii="Arial Narrow" w:cs="Arial Narrow" w:eastAsia="Arial Narrow" w:hAnsi="Arial Narrow"/>
+          <w:sz w:val="22"/>
+          <w:szCs w:val="22"/>
+          <w:rtl w:val="0"/>
+        </w:rPr>
+        <w:t xml:space="preserve">eliminar trámite(PUT,EDIT,PATCH,UPDATE,DELETE(solo en caso de que existan errores que no permitan la edición, de lo contrario el tramite aunque sea terminado o eliminado debe conservar un historial por determinado tiempo))</w:t>
+      </w:r>
+    </w:p>
+    <w:p>
+      <w:pPr>
+        <w:numPr>
+          <w:ilvl w:val="0"/>
+          <w:numId w:val="1"/>
+        </w:numPr>
+        <w:ind w:left="720" w:hanging="360"/>
+        <w:rPr>
+          <w:rFonts w:ascii="Arial Narrow" w:cs="Arial Narrow" w:eastAsia="Arial Narrow" w:hAnsi="Arial Narrow"/>
+          <w:sz w:val="22"/>
+          <w:szCs w:val="22"/>
+          <w:u w:val="none"/>
+        </w:rPr>
+      </w:pPr>
+      <w:bookmarkStart w:colFirst="0" w:colLast="0" w:name="_heading=h.5cyrfnzi8336" w:id="7"/>
+      <w:bookmarkEnd w:id="7"/>
+      <w:r>
+        <w:rPr>
+          <w:rFonts w:ascii="Arial Narrow" w:cs="Arial Narrow" w:eastAsia="Arial Narrow" w:hAnsi="Arial Narrow"/>
+          <w:sz w:val="22"/>
+          <w:szCs w:val="22"/>
+          <w:rtl w:val="0"/>
+        </w:rPr>
+        <w:t xml:space="preserve">CRUD general de persona</w:t>
+      </w:r>
+    </w:p>
+    <w:p>
+      <w:pPr>
+        <w:numPr>
+          <w:ilvl w:val="0"/>
+          <w:numId w:val="1"/>
+        </w:numPr>
+        <w:ind w:left="720" w:hanging="360"/>
+        <w:rPr>
+          <w:rFonts w:ascii="Arial Narrow" w:cs="Arial Narrow" w:eastAsia="Arial Narrow" w:hAnsi="Arial Narrow"/>
+          <w:sz w:val="22"/>
+          <w:szCs w:val="22"/>
+          <w:u w:val="none"/>
+        </w:rPr>
+      </w:pPr>
+      <w:bookmarkStart w:colFirst="0" w:colLast="0" w:name="_heading=h.6tagjtcg2cz5" w:id="8"/>
+      <w:bookmarkEnd w:id="8"/>
+      <w:r>
+        <w:rPr>
+          <w:rFonts w:ascii="Arial Narrow" w:cs="Arial Narrow" w:eastAsia="Arial Narrow" w:hAnsi="Arial Narrow"/>
+          <w:sz w:val="22"/>
+          <w:szCs w:val="22"/>
+          <w:rtl w:val="0"/>
+        </w:rPr>
+        <w:t xml:space="preserve">registro de usuario</w:t>
+      </w:r>
+    </w:p>
+    <w:p>
+      <w:pPr>
+        <w:numPr>
+          <w:ilvl w:val="0"/>
+          <w:numId w:val="1"/>
+        </w:numPr>
+        <w:ind w:left="720" w:hanging="360"/>
+        <w:rPr>
+          <w:rFonts w:ascii="Arial Narrow" w:cs="Arial Narrow" w:eastAsia="Arial Narrow" w:hAnsi="Arial Narrow"/>
+          <w:sz w:val="22"/>
+          <w:szCs w:val="22"/>
+          <w:u w:val="none"/>
+        </w:rPr>
+      </w:pPr>
+      <w:bookmarkStart w:colFirst="0" w:colLast="0" w:name="_heading=h.hvmzcydo2iet" w:id="9"/>
+      <w:bookmarkEnd w:id="9"/>
+      <w:r>
+        <w:rPr>
+          <w:rFonts w:ascii="Arial Narrow" w:cs="Arial Narrow" w:eastAsia="Arial Narrow" w:hAnsi="Arial Narrow"/>
+          <w:sz w:val="22"/>
+          <w:szCs w:val="22"/>
+          <w:rtl w:val="0"/>
+        </w:rPr>
+        <w:t xml:space="preserve">acceso de usuario</w:t>
+      </w:r>
+    </w:p>
+    <w:p>
+      <w:pPr>
+        <w:numPr>
+          <w:ilvl w:val="1"/>
+          <w:numId w:val="1"/>
+        </w:numPr>
+        <w:ind w:left="1440" w:hanging="360"/>
+        <w:rPr>
+          <w:rFonts w:ascii="Arial Narrow" w:cs="Arial Narrow" w:eastAsia="Arial Narrow" w:hAnsi="Arial Narrow"/>
+          <w:sz w:val="22"/>
+          <w:szCs w:val="22"/>
+          <w:u w:val="none"/>
+        </w:rPr>
+      </w:pPr>
+      <w:bookmarkStart w:colFirst="0" w:colLast="0" w:name="_heading=h.edmjl94gnich" w:id="10"/>
+      <w:bookmarkEnd w:id="10"/>
+      <w:r>
+        <w:rPr>
+          <w:rFonts w:ascii="Arial Narrow" w:cs="Arial Narrow" w:eastAsia="Arial Narrow" w:hAnsi="Arial Narrow"/>
+          <w:sz w:val="22"/>
+          <w:szCs w:val="22"/>
+          <w:rtl w:val="0"/>
+        </w:rPr>
+        <w:t xml:space="preserve">autorización</w:t>
+      </w:r>
+    </w:p>
+    <w:p>
+      <w:pPr>
+        <w:numPr>
+          <w:ilvl w:val="1"/>
+          <w:numId w:val="1"/>
+        </w:numPr>
+        <w:ind w:left="1440" w:hanging="360"/>
+        <w:rPr>
+          <w:rFonts w:ascii="Arial Narrow" w:cs="Arial Narrow" w:eastAsia="Arial Narrow" w:hAnsi="Arial Narrow"/>
+          <w:sz w:val="22"/>
+          <w:szCs w:val="22"/>
+          <w:u w:val="none"/>
+        </w:rPr>
+      </w:pPr>
+      <w:bookmarkStart w:colFirst="0" w:colLast="0" w:name="_heading=h.n7uylz4o9xva" w:id="11"/>
+      <w:bookmarkEnd w:id="11"/>
+      <w:r>
+        <w:rPr>
+          <w:rFonts w:ascii="Arial Narrow" w:cs="Arial Narrow" w:eastAsia="Arial Narrow" w:hAnsi="Arial Narrow"/>
+          <w:sz w:val="22"/>
+          <w:szCs w:val="22"/>
+          <w:rtl w:val="0"/>
+        </w:rPr>
+        <w:t xml:space="preserve">token de acceso</w:t>
+      </w:r>
+    </w:p>
+    <w:p>
+      <w:pPr>
+        <w:numPr>
+          <w:ilvl w:val="1"/>
+          <w:numId w:val="1"/>
+        </w:numPr>
+        <w:ind w:left="1440" w:hanging="360"/>
+        <w:rPr>
+          <w:rFonts w:ascii="Arial Narrow" w:cs="Arial Narrow" w:eastAsia="Arial Narrow" w:hAnsi="Arial Narrow"/>
+          <w:sz w:val="22"/>
+          <w:szCs w:val="22"/>
+          <w:u w:val="none"/>
+        </w:rPr>
+      </w:pPr>
+      <w:bookmarkStart w:colFirst="0" w:colLast="0" w:name="_heading=h.xt89yw41chpi" w:id="12"/>
+      <w:bookmarkEnd w:id="12"/>
+      <w:r>
+        <w:rPr>
+          <w:rFonts w:ascii="Arial Narrow" w:cs="Arial Narrow" w:eastAsia="Arial Narrow" w:hAnsi="Arial Narrow"/>
+          <w:sz w:val="22"/>
+          <w:szCs w:val="22"/>
+          <w:rtl w:val="0"/>
+        </w:rPr>
+        <w:t xml:space="preserve">registro de actividades</w:t>
+      </w:r>
+    </w:p>
+    <w:p>
+      <w:pPr>
+        <w:rPr>
+          <w:rFonts w:ascii="Arial Narrow" w:cs="Arial Narrow" w:eastAsia="Arial Narrow" w:hAnsi="Arial Narrow"/>
+          <w:sz w:val="22"/>
+          <w:szCs w:val="22"/>
+        </w:rPr>
+      </w:pPr>
+      <w:bookmarkStart w:colFirst="0" w:colLast="0" w:name="_heading=h.rteydnp1l12y" w:id="13"/>
+      <w:bookmarkEnd w:id="13"/>
+      <w:r>
+        <w:rPr>
+          <w:rFonts w:ascii="Arial Narrow" w:cs="Arial Narrow" w:eastAsia="Arial Narrow" w:hAnsi="Arial Narrow"/>
+          <w:sz w:val="22"/>
+          <w:szCs w:val="22"/>
+          <w:rtl w:val="0"/>
+        </w:rPr>
+        <w:t xml:space="preserve">herencias:</w:t>
+      </w:r>
+    </w:p>
+    <w:p>
+      <w:pPr>
+        <w:numPr>
+          <w:ilvl w:val="0"/>
+          <w:numId w:val="6"/>
+        </w:numPr>
+        <w:ind w:left="720" w:hanging="360"/>
+        <w:rPr>
+          <w:rFonts w:ascii="Arial Narrow" w:cs="Arial Narrow" w:eastAsia="Arial Narrow" w:hAnsi="Arial Narrow"/>
+          <w:sz w:val="22"/>
+          <w:szCs w:val="22"/>
+          <w:u w:val="none"/>
+        </w:rPr>
+      </w:pPr>
+      <w:bookmarkStart w:colFirst="0" w:colLast="0" w:name="_heading=h.mqw2cirp2ket" w:id="14"/>
+      <w:bookmarkEnd w:id="14"/>
+      <w:r>
+        <w:rPr>
+          <w:rFonts w:ascii="Arial Narrow" w:cs="Arial Narrow" w:eastAsia="Arial Narrow" w:hAnsi="Arial Narrow"/>
+          <w:sz w:val="22"/>
+          <w:szCs w:val="22"/>
+          <w:rtl w:val="0"/>
+        </w:rPr>
+        <w:t xml:space="preserve">los empleados pueden eredar la clases de persona,</w:t>
+      </w:r>
+    </w:p>
+    <w:p>
+      <w:pPr>
+        <w:numPr>
+          <w:ilvl w:val="0"/>
+          <w:numId w:val="6"/>
+        </w:numPr>
+        <w:ind w:left="720" w:hanging="360"/>
+        <w:rPr>
+          <w:rFonts w:ascii="Arial Narrow" w:cs="Arial Narrow" w:eastAsia="Arial Narrow" w:hAnsi="Arial Narrow"/>
+          <w:sz w:val="22"/>
+          <w:szCs w:val="22"/>
+          <w:u w:val="none"/>
+        </w:rPr>
+      </w:pPr>
+      <w:bookmarkStart w:colFirst="0" w:colLast="0" w:name="_heading=h.arv2ugp1zb5d" w:id="15"/>
+      <w:bookmarkEnd w:id="15"/>
+      <w:r>
+        <w:rPr>
+          <w:rFonts w:ascii="Arial Narrow" w:cs="Arial Narrow" w:eastAsia="Arial Narrow" w:hAnsi="Arial Narrow"/>
+          <w:sz w:val="22"/>
+          <w:szCs w:val="22"/>
+          <w:rtl w:val="0"/>
+        </w:rPr>
+        <w:t xml:space="preserve">los usuarios pueden heredar de persona y adicional de empleados</w:t>
+      </w:r>
+    </w:p>
+    <w:p>
+      <w:pPr>
+        <w:rPr>
+          <w:rFonts w:ascii="Arial Narrow" w:cs="Arial Narrow" w:eastAsia="Arial Narrow" w:hAnsi="Arial Narrow"/>
+          <w:sz w:val="22"/>
+          <w:szCs w:val="22"/>
+        </w:rPr>
+      </w:pPr>
+      <w:bookmarkStart w:colFirst="0" w:colLast="0" w:name="_heading=h.ruhmdfpfrlxw" w:id="16"/>
+      <w:bookmarkEnd w:id="16"/>
+      <w:r>
+        <w:rPr>
+          <w:rtl w:val="0"/>
+        </w:rPr>
+      </w:r>
+    </w:p>
+    <w:p>
+      <w:pPr>
+        <w:rPr>
+          <w:rFonts w:ascii="Arial Narrow" w:cs="Arial Narrow" w:eastAsia="Arial Narrow" w:hAnsi="Arial Narrow"/>
+          <w:sz w:val="22"/>
+          <w:szCs w:val="22"/>
+        </w:rPr>
+      </w:pPr>
+      <w:bookmarkStart w:colFirst="0" w:colLast="0" w:name="_heading=h.dlxr7rdsngsz" w:id="17"/>
+      <w:bookmarkEnd w:id="17"/>
+      <w:r>
+        <w:rPr>
+          <w:rFonts w:ascii="Arial Narrow" w:cs="Arial Narrow" w:eastAsia="Arial Narrow" w:hAnsi="Arial Narrow"/>
+          <w:sz w:val="22"/>
+          <w:szCs w:val="22"/>
+          <w:rtl w:val="0"/>
+        </w:rPr>
+        <w:t xml:space="preserve">otros componentes y/o consideraciones</w:t>
+      </w:r>
+    </w:p>
+    <w:p>
+      <w:pPr>
+        <w:numPr>
+          <w:ilvl w:val="0"/>
+          <w:numId w:val="7"/>
+        </w:numPr>
+        <w:ind w:left="720" w:hanging="360"/>
+        <w:rPr>
+          <w:rFonts w:ascii="Arial Narrow" w:cs="Arial Narrow" w:eastAsia="Arial Narrow" w:hAnsi="Arial Narrow"/>
+          <w:sz w:val="22"/>
+          <w:szCs w:val="22"/>
+          <w:u w:val="none"/>
+        </w:rPr>
+      </w:pPr>
+      <w:bookmarkStart w:colFirst="0" w:colLast="0" w:name="_heading=h.emd2wtvcl77s" w:id="18"/>
+      <w:bookmarkEnd w:id="18"/>
+      <w:r>
+        <w:rPr>
+          <w:rFonts w:ascii="Arial Narrow" w:cs="Arial Narrow" w:eastAsia="Arial Narrow" w:hAnsi="Arial Narrow"/>
+          <w:sz w:val="22"/>
+          <w:szCs w:val="22"/>
+          <w:rtl w:val="0"/>
+        </w:rPr>
+        <w:t xml:space="preserve">interfaces para definir manipulación de documentos y carga de los mismos en una cloud</w:t>
+      </w:r>
+    </w:p>
+    <w:p>
+      <w:pPr>
+        <w:numPr>
+          <w:ilvl w:val="0"/>
+          <w:numId w:val="7"/>
+        </w:numPr>
+        <w:ind w:left="720" w:hanging="360"/>
+        <w:rPr>
+          <w:rFonts w:ascii="Arial Narrow" w:cs="Arial Narrow" w:eastAsia="Arial Narrow" w:hAnsi="Arial Narrow"/>
+          <w:sz w:val="22"/>
+          <w:szCs w:val="22"/>
+          <w:u w:val="none"/>
+        </w:rPr>
+      </w:pPr>
+      <w:bookmarkStart w:colFirst="0" w:colLast="0" w:name="_heading=h.lham0v5m8489" w:id="19"/>
+      <w:bookmarkEnd w:id="19"/>
+      <w:r>
+        <w:rPr>
+          <w:rFonts w:ascii="Arial Narrow" w:cs="Arial Narrow" w:eastAsia="Arial Narrow" w:hAnsi="Arial Narrow"/>
+          <w:sz w:val="22"/>
+          <w:szCs w:val="22"/>
+          <w:rtl w:val="0"/>
+        </w:rPr>
+        <w:t xml:space="preserve">es recomendable usar una BD relacional para poder general las relaciones entre las clases</w:t>
+      </w:r>
+    </w:p>
+    <w:p>
+      <w:pPr>
+        <w:numPr>
+          <w:ilvl w:val="0"/>
+          <w:numId w:val="7"/>
+        </w:numPr>
+        <w:ind w:left="720" w:hanging="360"/>
+        <w:rPr>
+          <w:rFonts w:ascii="Arial Narrow" w:cs="Arial Narrow" w:eastAsia="Arial Narrow" w:hAnsi="Arial Narrow"/>
+          <w:sz w:val="22"/>
+          <w:szCs w:val="22"/>
+          <w:u w:val="none"/>
+        </w:rPr>
+      </w:pPr>
+      <w:bookmarkStart w:colFirst="0" w:colLast="0" w:name="_heading=h.8khpkot7fki6" w:id="20"/>
+      <w:bookmarkEnd w:id="20"/>
+      <w:r>
+        <w:rPr>
+          <w:rFonts w:ascii="Arial Narrow" w:cs="Arial Narrow" w:eastAsia="Arial Narrow" w:hAnsi="Arial Narrow"/>
+          <w:sz w:val="22"/>
+          <w:szCs w:val="22"/>
+          <w:rtl w:val="0"/>
+        </w:rPr>
+        <w:t xml:space="preserve">Implementación de componentes de seguridad como JWT para las autenticaciones</w:t>
+      </w:r>
+    </w:p>
+    <w:p>
+      <w:pPr>
+        <w:ind w:left="720" w:firstLine="0"/>
+        <w:rPr>
+          <w:rFonts w:ascii="Arial Narrow" w:cs="Arial Narrow" w:eastAsia="Arial Narrow" w:hAnsi="Arial Narrow"/>
+          <w:sz w:val="22"/>
+          <w:szCs w:val="22"/>
+        </w:rPr>
+      </w:pPr>
+      <w:bookmarkStart w:colFirst="0" w:colLast="0" w:name="_heading=h.c9di6g9ak88c" w:id="21"/>
+      <w:bookmarkEnd w:id="21"/>
+      <w:r>
+        <w:rPr>
+          <w:rtl w:val="0"/>
+        </w:rPr>
+      </w:r>
+    </w:p>
+    <w:p>
+      <w:pPr>
+        <w:keepNext w:val="1"/>
+        <w:keepLines w:val="0"/>
+        <w:pageBreakBefore w:val="0"/>
+        <w:widowControl w:val="1"/>
+        <w:pBdr>
+          <w:top w:space="0" w:sz="0" w:val="nil"/>
+          <w:left w:space="0" w:sz="0" w:val="nil"/>
+          <w:bottom w:space="0" w:sz="0" w:val="nil"/>
+          <w:right w:space="0" w:sz="0" w:val="nil"/>
+          <w:between w:space="0" w:sz="0" w:val="nil"/>
+        </w:pBdr>
+        <w:shd w:fill="auto" w:val="clear"/>
+        <w:spacing w:after="60" w:before="240" w:line="240" w:lineRule="auto"/>
+        <w:ind w:left="0" w:right="0" w:firstLine="0"/>
+        <w:jc w:val="left"/>
+        <w:rPr>
+          <w:rFonts w:ascii="Cambria" w:cs="Cambria" w:eastAsia="Cambria" w:hAnsi="Cambria"/>
+          <w:b w:val="1"/>
+          <w:i w:val="1"/>
+          <w:smallCaps w:val="0"/>
+          <w:strike w:val="0"/>
+          <w:color w:val="000000"/>
+          <w:sz w:val="28"/>
+          <w:szCs w:val="28"/>
+          <w:u w:val="none"/>
+          <w:shd w:fill="auto" w:val="clear"/>
+          <w:vertAlign w:val="baseline"/>
+        </w:rPr>
+      </w:pPr>
+      <w:r>
+        <w:rPr>
+          <w:rFonts w:ascii="Cambria" w:cs="Cambria" w:eastAsia="Cambria" w:hAnsi="Cambria"/>
+          <w:b w:val="1"/>
+          <w:i w:val="1"/>
+          <w:smallCaps w:val="0"/>
+          <w:strike w:val="0"/>
+          <w:color w:val="000000"/>
+          <w:sz w:val="28"/>
+          <w:szCs w:val="28"/>
+          <w:u w:val="none"/>
+          <w:shd w:fill="auto" w:val="clear"/>
+          <w:vertAlign w:val="baseline"/>
+          <w:rtl w:val="0"/>
+        </w:rPr>
+        <w:t xml:space="preserve">3. Consideraciones de </w:t>
+      </w:r>
+      <w:r>
+        <w:rPr>
+          <w:rFonts w:ascii="Cambria" w:cs="Cambria" w:eastAsia="Cambria" w:hAnsi="Cambria"/>
+          <w:b w:val="1"/>
+          <w:i w:val="1"/>
+          <w:sz w:val="28"/>
+          <w:szCs w:val="28"/>
+          <w:rtl w:val="0"/>
+        </w:rPr>
+        <w:t xml:space="preserve">i</w:t>
+      </w:r>
+      <w:r>
+        <w:rPr>
+          <w:rFonts w:ascii="Cambria" w:cs="Cambria" w:eastAsia="Cambria" w:hAnsi="Cambria"/>
+          <w:b w:val="1"/>
+          <w:i w:val="1"/>
+          <w:smallCaps w:val="0"/>
+          <w:strike w:val="0"/>
+          <w:color w:val="000000"/>
+          <w:sz w:val="28"/>
+          <w:szCs w:val="28"/>
+          <w:u w:val="none"/>
+          <w:shd w:fill="auto" w:val="clear"/>
+          <w:vertAlign w:val="baseline"/>
+          <w:rtl w:val="0"/>
+        </w:rPr>
+        <w:t xml:space="preserve">mplementación JAVA </w:t>
+      </w:r>
+    </w:p>
+    <w:p>
+      <w:pPr>
+        <w:rPr>
+          <w:rFonts w:ascii="Arial Narrow" w:cs="Arial Narrow" w:eastAsia="Arial Narrow" w:hAnsi="Arial Narrow"/>
+          <w:b w:val="0"/>
+          <w:sz w:val="22"/>
+          <w:szCs w:val="22"/>
+          <w:vertAlign w:val="baseline"/>
+        </w:rPr>
+      </w:pPr>
+      <w:r>
+        <w:rPr>
+          <w:rtl w:val="0"/>
+        </w:rPr>
+      </w:r>
+    </w:p>
+    <w:p>
+      <w:pPr>
+        <w:rPr>
+          <w:rFonts w:ascii="Arial Narrow" w:cs="Arial Narrow" w:eastAsia="Arial Narrow" w:hAnsi="Arial Narrow"/>
+          <w:sz w:val="22"/>
+          <w:szCs w:val="22"/>
+          <w:vertAlign w:val="baseline"/>
+        </w:rPr>
+      </w:pPr>
+      <w:r>
+        <w:rPr>
+          <w:rtl w:val="0"/>
+        </w:rPr>
+      </w:r>
+    </w:p>
+    <w:p>
+      <w:pPr>
+        <w:rPr>
+          <w:rFonts w:ascii="Arial Narrow" w:cs="Arial Narrow" w:eastAsia="Arial Narrow" w:hAnsi="Arial Narrow"/>
+          <w:b w:val="0"/>
+          <w:sz w:val="22"/>
+          <w:szCs w:val="22"/>
+          <w:vertAlign w:val="baseline"/>
+        </w:rPr>
+      </w:pPr>
+      <w:r>
+        <w:rPr>
+          <w:rFonts w:ascii="Arial Narrow" w:cs="Arial Narrow" w:eastAsia="Arial Narrow" w:hAnsi="Arial Narrow"/>
+          <w:b w:val="1"/>
+          <w:sz w:val="22"/>
+          <w:szCs w:val="22"/>
+          <w:vertAlign w:val="baseline"/>
+          <w:rtl w:val="0"/>
+        </w:rPr>
+        <w:t xml:space="preserve">REQUERIMIENTO</w:t>
+      </w:r>
+      <w:r>
+        <w:rPr>
+          <w:rtl w:val="0"/>
+        </w:rPr>
+      </w:r>
+    </w:p>
+    <w:p>
+      <w:pPr>
+        <w:rPr>
+          <w:rFonts w:ascii="Arial Narrow" w:cs="Arial Narrow" w:eastAsia="Arial Narrow" w:hAnsi="Arial Narrow"/>
+          <w:sz w:val="22"/>
+          <w:szCs w:val="22"/>
+          <w:vertAlign w:val="baseline"/>
+        </w:rPr>
+      </w:pPr>
+      <w:r>
+        <w:rPr>
+          <w:rFonts w:ascii="Arial Narrow" w:cs="Arial Narrow" w:eastAsia="Arial Narrow" w:hAnsi="Arial Narrow"/>
+          <w:sz w:val="22"/>
+          <w:szCs w:val="22"/>
+          <w:vertAlign w:val="baseline"/>
+          <w:rtl w:val="0"/>
+        </w:rPr>
+        <w:t xml:space="preserve">Construya un formulario con su correspondiente Base de datos que permita realizar una encuesta </w:t>
+      </w:r>
+      <w:r>
+        <w:rPr>
+          <w:rFonts w:ascii="Arial Narrow" w:cs="Arial Narrow" w:eastAsia="Arial Narrow" w:hAnsi="Arial Narrow"/>
+          <w:b w:val="1"/>
+          <w:sz w:val="22"/>
+          <w:szCs w:val="22"/>
+          <w:vertAlign w:val="baseline"/>
+          <w:rtl w:val="0"/>
+        </w:rPr>
+        <w:t xml:space="preserve">vía web, </w:t>
+      </w:r>
+      <w:r>
+        <w:rPr>
+          <w:rFonts w:ascii="Arial Narrow" w:cs="Arial Narrow" w:eastAsia="Arial Narrow" w:hAnsi="Arial Narrow"/>
+          <w:sz w:val="22"/>
+          <w:szCs w:val="22"/>
+          <w:vertAlign w:val="baseline"/>
+          <w:rtl w:val="0"/>
+        </w:rPr>
+        <w:t xml:space="preserve">con los siguientes campos (Nombre, apellido, marca de PC, fecha y hora de registro, email</w:t>
+      </w:r>
+      <w:r>
+        <w:rPr>
+          <w:rFonts w:ascii="Arial Narrow" w:cs="Arial Narrow" w:eastAsia="Arial Narrow" w:hAnsi="Arial Narrow"/>
+          <w:b w:val="1"/>
+          <w:sz w:val="22"/>
+          <w:szCs w:val="22"/>
+          <w:vertAlign w:val="baseline"/>
+          <w:rtl w:val="0"/>
+        </w:rPr>
+        <w:t xml:space="preserve">)</w:t>
+      </w:r>
+      <w:r>
+        <w:rPr>
+          <w:rFonts w:ascii="Arial Narrow" w:cs="Arial Narrow" w:eastAsia="Arial Narrow" w:hAnsi="Arial Narrow"/>
+          <w:sz w:val="22"/>
+          <w:szCs w:val="22"/>
+          <w:vertAlign w:val="baseline"/>
+          <w:rtl w:val="0"/>
+        </w:rPr>
+        <w:t xml:space="preserve">:</w:t>
+      </w:r>
+    </w:p>
+    <w:p>
+      <w:pPr>
+        <w:rPr>
+          <w:rFonts w:ascii="Arial Narrow" w:cs="Arial Narrow" w:eastAsia="Arial Narrow" w:hAnsi="Arial Narrow"/>
+          <w:sz w:val="22"/>
+          <w:szCs w:val="22"/>
+        </w:rPr>
+      </w:pPr>
+      <w:r>
+        <w:rPr>
+          <w:rFonts w:ascii="Arial Narrow" w:cs="Arial Narrow" w:eastAsia="Arial Narrow" w:hAnsi="Arial Narrow"/>
+          <w:sz w:val="22"/>
+          <w:szCs w:val="22"/>
+        </w:rPr>
+        <w:drawing>
+          <wp:inline distB="114300" distT="114300" distL="114300" distR="114300">
+            <wp:extent cx="5612130" cy="2857500"/>
+            <wp:effectExtent b="0" l="0" r="0" t="0"/>
+            <wp:docPr id="6" name="image3.png"/>
+            <a:graphic>
+              <a:graphicData uri="http://schemas.openxmlformats.org/drawingml/2006/picture">
+                <pic:pic>
+                  <pic:nvPicPr>
+                    <pic:cNvPr id="0" name="image3.png"/>
+                    <pic:cNvPicPr preferRelativeResize="0"/>
+                  </pic:nvPicPr>
+                  <pic:blipFill>
+                    <a:blip r:embed="rId8"/>
+                    <a:srcRect b="0" l="0" r="0" t="0"/>
+                    <a:stretch>
+                      <a:fillRect/>
+                    </a:stretch>
+                  </pic:blipFill>
+                  <pic:spPr>
+                    <a:xfrm>
+                      <a:off x="0" y="0"/>
                       <a:ext cx="5612130" cy="2857500"/>
                     </a:xfrm>
                     <a:prstGeom prst="rect"/>
@@ -2518,7 +2557,7 @@
           <w:vertAlign w:val="baseline"/>
         </w:rPr>
       </w:pPr>
-      <w:hyperlink r:id="rId8">
+      <w:hyperlink r:id="rId9">
         <w:r>
           <w:rPr>
             <w:rFonts w:ascii="Arial Narrow" w:cs="Arial Narrow" w:eastAsia="Arial Narrow" w:hAnsi="Arial Narrow"/>
@@ -2781,7 +2820,7 @@
                     <pic:cNvPicPr preferRelativeResize="0"/>
                   </pic:nvPicPr>
                   <pic:blipFill>
-                    <a:blip r:embed="rId9"/>
+                    <a:blip r:embed="rId10"/>
                     <a:srcRect b="0" l="0" r="0" t="0"/>
                     <a:stretch>
                       <a:fillRect/>
@@ -2880,7 +2919,7 @@
           <w:szCs w:val="22"/>
         </w:rPr>
       </w:pPr>
-      <w:hyperlink r:id="rId10">
+      <w:hyperlink r:id="rId11">
         <w:r>
           <w:rPr>
             <w:rFonts w:ascii="Arial Narrow" w:cs="Arial Narrow" w:eastAsia="Arial Narrow" w:hAnsi="Arial Narrow"/>
@@ -2938,7 +2977,7 @@
       </w:r>
     </w:p>
     <w:sectPr>
-      <w:headerReference r:id="rId11" w:type="default"/>
+      <w:headerReference r:id="rId12" w:type="default"/>
       <w:pgSz w:h="15842" w:w="12242" w:orient="portrait"/>
       <w:pgMar w:bottom="567" w:top="567" w:left="1701" w:right="1701" w:header="709" w:footer="709"/>
       <w:pgNumType w:start="1"/>
@@ -3095,12 +3134,12 @@
               <wp:extent cx="635" cy="12700"/>
               <wp:effectExtent b="0" l="0" r="0" t="0"/>
               <wp:wrapNone/>
-              <wp:docPr id="2" name="image4.png"/>
+              <wp:docPr id="2" name="image5.png"/>
               <a:graphic>
                 <a:graphicData uri="http://schemas.openxmlformats.org/drawingml/2006/picture">
                   <pic:pic>
                     <pic:nvPicPr>
-                      <pic:cNvPr id="0" name="image4.png"/>
+                      <pic:cNvPr id="0" name="image5.png"/>
                       <pic:cNvPicPr preferRelativeResize="0"/>
                     </pic:nvPicPr>
                     <pic:blipFill>
@@ -3343,12 +3382,12 @@
               <wp:extent cx="635" cy="12700"/>
               <wp:effectExtent b="0" l="0" r="0" t="0"/>
               <wp:wrapNone/>
-              <wp:docPr id="1" name="image3.png"/>
+              <wp:docPr id="1" name="image4.png"/>
               <a:graphic>
                 <a:graphicData uri="http://schemas.openxmlformats.org/drawingml/2006/picture">
                   <pic:pic>
                     <pic:nvPicPr>
-                      <pic:cNvPr id="0" name="image3.png"/>
+                      <pic:cNvPr id="0" name="image4.png"/>
                       <pic:cNvPicPr preferRelativeResize="0"/>
                     </pic:nvPicPr>
                     <pic:blipFill>
@@ -3437,12 +3476,12 @@
               <wp:extent cx="635" cy="12700"/>
               <wp:effectExtent b="0" l="0" r="0" t="0"/>
               <wp:wrapNone/>
-              <wp:docPr id="3" name="image5.png"/>
+              <wp:docPr id="3" name="image6.png"/>
               <a:graphic>
                 <a:graphicData uri="http://schemas.openxmlformats.org/drawingml/2006/picture">
                   <pic:pic>
                     <pic:nvPicPr>
-                      <pic:cNvPr id="0" name="image5.png"/>
+                      <pic:cNvPr id="0" name="image6.png"/>
                       <pic:cNvPicPr preferRelativeResize="0"/>
                     </pic:nvPicPr>
                     <pic:blipFill>

</xml_diff>